<commit_message>
Adicionando o nome dos responsáveis nas Quinzenas.
</commit_message>
<xml_diff>
--- a/DRP01 - Plano de Ação - Sistema de Cadastro de Clientes.docx
+++ b/DRP01 - Plano de Ação - Sistema de Cadastro de Clientes.docx
@@ -28,7 +28,7 @@
     </w:p>
     <w:tbl>
       <w:tblPr>
-        <w:tblStyle w:val="TableGrid"/>
+        <w:tblStyle w:val="Tabelacomgrade"/>
         <w:tblW w:w="0" w:type="auto"/>
         <w:tblBorders>
           <w:bottom w:val="single" w:sz="2" w:space="0" w:color="auto"/>
@@ -91,8 +91,13 @@
             <w:pPr>
               <w:spacing w:after="0" w:line="360" w:lineRule="auto"/>
             </w:pPr>
-            <w:r>
-              <w:t>Kaique Lourenço de Andrade, RA 24214438 (Polo Itapevi - Tecnologia da Informação)</w:t>
+            <w:proofErr w:type="spellStart"/>
+            <w:r>
+              <w:t>Kaique</w:t>
+            </w:r>
+            <w:proofErr w:type="spellEnd"/>
+            <w:r>
+              <w:t xml:space="preserve"> Lourenço de Andrade, RA 24214438 (Polo Itapevi - Tecnologia da Informação)</w:t>
             </w:r>
           </w:p>
           <w:p>
@@ -108,7 +113,15 @@
               <w:spacing w:after="0" w:line="360" w:lineRule="auto"/>
             </w:pPr>
             <w:r>
-              <w:t xml:space="preserve">Luiz Antonio Lopes Junior, RA 1706120 (Polo Mogi das Cruzes </w:t>
+              <w:t xml:space="preserve">Luiz </w:t>
+            </w:r>
+            <w:proofErr w:type="spellStart"/>
+            <w:r>
+              <w:t>Antonio</w:t>
+            </w:r>
+            <w:proofErr w:type="spellEnd"/>
+            <w:r>
+              <w:t xml:space="preserve"> Lopes Junior, RA 1706120 (Polo Mogi das Cruzes </w:t>
             </w:r>
             <w:r>
               <w:t>–</w:t>
@@ -152,7 +165,15 @@
               <w:spacing w:after="0" w:line="360" w:lineRule="auto"/>
             </w:pPr>
             <w:r>
-              <w:t>Wallace Eliziario de Souza, RA 24215671 (Polo Diadema - Ciência de Dados)</w:t>
+              <w:t xml:space="preserve">Wallace </w:t>
+            </w:r>
+            <w:proofErr w:type="spellStart"/>
+            <w:r>
+              <w:t>Eliziario</w:t>
+            </w:r>
+            <w:proofErr w:type="spellEnd"/>
+            <w:r>
+              <w:t xml:space="preserve"> de Souza, RA 24215671 (Polo Diadema - Ciência de Dados)</w:t>
             </w:r>
           </w:p>
         </w:tc>
@@ -770,7 +791,7 @@
     </w:p>
     <w:tbl>
       <w:tblPr>
-        <w:tblStyle w:val="TableGrid"/>
+        <w:tblStyle w:val="Tabelacomgrade"/>
         <w:tblW w:w="8502" w:type="dxa"/>
         <w:tblBorders>
           <w:top w:val="none" w:sz="0" w:space="0" w:color="auto"/>
@@ -913,7 +934,7 @@
     </w:p>
     <w:tbl>
       <w:tblPr>
-        <w:tblStyle w:val="TableGrid"/>
+        <w:tblStyle w:val="Tabelacomgrade"/>
         <w:tblW w:w="8502" w:type="dxa"/>
         <w:tblBorders>
           <w:top w:val="none" w:sz="0" w:space="0" w:color="auto"/>
@@ -962,7 +983,23 @@
                 <w:rFonts w:ascii="Trebuchet MS" w:hAnsi="Trebuchet MS"/>
                 <w:color w:val="000000" w:themeColor="text1"/>
               </w:rPr>
-              <w:t>A conversa citada na questão supracitada ocorreu com a Srta Sabrina de Freitas  Theodoro, na condição de sócia</w:t>
+              <w:t xml:space="preserve">A conversa citada na questão supracitada ocorreu com a </w:t>
+            </w:r>
+            <w:proofErr w:type="spellStart"/>
+            <w:r>
+              <w:rPr>
+                <w:rFonts w:ascii="Trebuchet MS" w:hAnsi="Trebuchet MS"/>
+                <w:color w:val="000000" w:themeColor="text1"/>
+              </w:rPr>
+              <w:t>Srta</w:t>
+            </w:r>
+            <w:proofErr w:type="spellEnd"/>
+            <w:r>
+              <w:rPr>
+                <w:rFonts w:ascii="Trebuchet MS" w:hAnsi="Trebuchet MS"/>
+                <w:color w:val="000000" w:themeColor="text1"/>
+              </w:rPr>
+              <w:t xml:space="preserve"> Sabrina de Freitas  Theodoro, na condição de sócia</w:t>
             </w:r>
             <w:r>
               <w:rPr>
@@ -1124,7 +1161,7 @@
     </w:p>
     <w:tbl>
       <w:tblPr>
-        <w:tblStyle w:val="TableGrid"/>
+        <w:tblStyle w:val="Tabelacomgrade"/>
         <w:tblW w:w="17004" w:type="dxa"/>
         <w:tblBorders>
           <w:top w:val="none" w:sz="0" w:space="0" w:color="auto"/>
@@ -1374,7 +1411,7 @@
     </w:p>
     <w:tbl>
       <w:tblPr>
-        <w:tblStyle w:val="TableGrid"/>
+        <w:tblStyle w:val="Tabelacomgrade"/>
         <w:tblW w:w="8502" w:type="dxa"/>
         <w:tblBorders>
           <w:top w:val="none" w:sz="0" w:space="0" w:color="auto"/>
@@ -1450,7 +1487,23 @@
                 <w:rFonts w:ascii="Trebuchet MS" w:hAnsi="Trebuchet MS"/>
                 <w:color w:val="000000" w:themeColor="text1"/>
               </w:rPr>
-              <w:t xml:space="preserve"> empresa, permitindo registrar, consultar, editar e excluir informações de clientes. O sistema será desenvolvido utilizando Python (backend), banco de dados para armazenamento das informações e HTML</w:t>
+              <w:t xml:space="preserve"> empresa, permitindo registrar, consultar, editar e excluir informações de clientes. O sistema será desenvolvido utilizando Python (</w:t>
+            </w:r>
+            <w:proofErr w:type="spellStart"/>
+            <w:r>
+              <w:rPr>
+                <w:rFonts w:ascii="Trebuchet MS" w:hAnsi="Trebuchet MS"/>
+                <w:color w:val="000000" w:themeColor="text1"/>
+              </w:rPr>
+              <w:t>backend</w:t>
+            </w:r>
+            <w:proofErr w:type="spellEnd"/>
+            <w:r>
+              <w:rPr>
+                <w:rFonts w:ascii="Trebuchet MS" w:hAnsi="Trebuchet MS"/>
+                <w:color w:val="000000" w:themeColor="text1"/>
+              </w:rPr>
+              <w:t>), banco de dados para armazenamento das informações e HTML</w:t>
             </w:r>
             <w:r>
               <w:rPr>
@@ -1544,7 +1597,7 @@
     <w:p/>
     <w:tbl>
       <w:tblPr>
-        <w:tblStyle w:val="TableGrid"/>
+        <w:tblStyle w:val="Tabelacomgrade"/>
         <w:tblW w:w="0" w:type="auto"/>
         <w:tblCellMar>
           <w:top w:w="57" w:type="dxa"/>
@@ -1553,11 +1606,11 @@
         <w:tblLook w:val="04A0" w:firstRow="1" w:lastRow="0" w:firstColumn="1" w:lastColumn="0" w:noHBand="0" w:noVBand="1"/>
       </w:tblPr>
       <w:tblGrid>
-        <w:gridCol w:w="4382"/>
-        <w:gridCol w:w="2831"/>
-        <w:gridCol w:w="1558"/>
-        <w:gridCol w:w="1417"/>
-        <w:gridCol w:w="4460"/>
+        <w:gridCol w:w="2033"/>
+        <w:gridCol w:w="1725"/>
+        <w:gridCol w:w="1411"/>
+        <w:gridCol w:w="1380"/>
+        <w:gridCol w:w="2447"/>
       </w:tblGrid>
       <w:tr>
         <w:trPr>
@@ -1567,7 +1620,7 @@
         </w:trPr>
         <w:tc>
           <w:tcPr>
-            <w:tcW w:w="14668" w:type="dxa"/>
+            <w:tcW w:w="14648" w:type="dxa"/>
             <w:gridSpan w:val="5"/>
             <w:tcBorders>
               <w:top w:val="single" w:sz="12" w:space="0" w:color="000000" w:themeColor="text1"/>
@@ -1638,7 +1691,7 @@
         </w:trPr>
         <w:tc>
           <w:tcPr>
-            <w:tcW w:w="4390" w:type="dxa"/>
+            <w:tcW w:w="4382" w:type="dxa"/>
             <w:tcBorders>
               <w:top w:val="single" w:sz="2" w:space="0" w:color="auto"/>
               <w:left w:val="single" w:sz="12" w:space="0" w:color="000000" w:themeColor="text1"/>
@@ -1657,7 +1710,7 @@
         </w:tc>
         <w:tc>
           <w:tcPr>
-            <w:tcW w:w="2835" w:type="dxa"/>
+            <w:tcW w:w="2831" w:type="dxa"/>
             <w:tcBorders>
               <w:top w:val="single" w:sz="2" w:space="0" w:color="auto"/>
             </w:tcBorders>
@@ -1675,7 +1728,7 @@
         </w:tc>
         <w:tc>
           <w:tcPr>
-            <w:tcW w:w="1559" w:type="dxa"/>
+            <w:tcW w:w="1558" w:type="dxa"/>
             <w:tcBorders>
               <w:top w:val="single" w:sz="2" w:space="0" w:color="auto"/>
             </w:tcBorders>
@@ -1711,7 +1764,7 @@
         </w:tc>
         <w:tc>
           <w:tcPr>
-            <w:tcW w:w="4467" w:type="dxa"/>
+            <w:tcW w:w="4460" w:type="dxa"/>
             <w:tcBorders>
               <w:top w:val="single" w:sz="2" w:space="0" w:color="auto"/>
               <w:right w:val="single" w:sz="12" w:space="0" w:color="000000" w:themeColor="text1"/>
@@ -1735,7 +1788,7 @@
         </w:trPr>
         <w:tc>
           <w:tcPr>
-            <w:tcW w:w="4390" w:type="dxa"/>
+            <w:tcW w:w="4382" w:type="dxa"/>
             <w:tcBorders>
               <w:left w:val="single" w:sz="12" w:space="0" w:color="000000" w:themeColor="text1"/>
             </w:tcBorders>
@@ -1751,7 +1804,7 @@
         </w:tc>
         <w:tc>
           <w:tcPr>
-            <w:tcW w:w="2835" w:type="dxa"/>
+            <w:tcW w:w="2831" w:type="dxa"/>
           </w:tcPr>
           <w:p>
             <w:pPr>
@@ -1764,7 +1817,7 @@
         </w:tc>
         <w:tc>
           <w:tcPr>
-            <w:tcW w:w="1559" w:type="dxa"/>
+            <w:tcW w:w="1558" w:type="dxa"/>
           </w:tcPr>
           <w:p>
             <w:pPr>
@@ -1790,7 +1843,7 @@
         </w:tc>
         <w:tc>
           <w:tcPr>
-            <w:tcW w:w="4467" w:type="dxa"/>
+            <w:tcW w:w="4460" w:type="dxa"/>
             <w:tcBorders>
               <w:right w:val="single" w:sz="12" w:space="0" w:color="000000" w:themeColor="text1"/>
             </w:tcBorders>
@@ -1811,7 +1864,7 @@
         </w:trPr>
         <w:tc>
           <w:tcPr>
-            <w:tcW w:w="4390" w:type="dxa"/>
+            <w:tcW w:w="4382" w:type="dxa"/>
             <w:tcBorders>
               <w:left w:val="single" w:sz="12" w:space="0" w:color="000000" w:themeColor="text1"/>
             </w:tcBorders>
@@ -1827,17 +1880,25 @@
         </w:tc>
         <w:tc>
           <w:tcPr>
-            <w:tcW w:w="2835" w:type="dxa"/>
-          </w:tcPr>
-          <w:p>
-            <w:pPr>
-              <w:spacing w:after="0"/>
-            </w:pPr>
-          </w:p>
-        </w:tc>
-        <w:tc>
-          <w:tcPr>
-            <w:tcW w:w="1559" w:type="dxa"/>
+            <w:tcW w:w="2831" w:type="dxa"/>
+          </w:tcPr>
+          <w:p>
+            <w:pPr>
+              <w:spacing w:after="0"/>
+            </w:pPr>
+            <w:proofErr w:type="spellStart"/>
+            <w:r>
+              <w:t>Kaique</w:t>
+            </w:r>
+            <w:proofErr w:type="spellEnd"/>
+            <w:r>
+              <w:t xml:space="preserve"> Lourenço de Andrade</w:t>
+            </w:r>
+          </w:p>
+        </w:tc>
+        <w:tc>
+          <w:tcPr>
+            <w:tcW w:w="1558" w:type="dxa"/>
           </w:tcPr>
           <w:p>
             <w:pPr>
@@ -1863,7 +1924,7 @@
         </w:tc>
         <w:tc>
           <w:tcPr>
-            <w:tcW w:w="4467" w:type="dxa"/>
+            <w:tcW w:w="4460" w:type="dxa"/>
             <w:tcBorders>
               <w:right w:val="single" w:sz="12" w:space="0" w:color="000000" w:themeColor="text1"/>
             </w:tcBorders>
@@ -1884,7 +1945,7 @@
         </w:trPr>
         <w:tc>
           <w:tcPr>
-            <w:tcW w:w="4390" w:type="dxa"/>
+            <w:tcW w:w="4382" w:type="dxa"/>
             <w:tcBorders>
               <w:left w:val="single" w:sz="12" w:space="0" w:color="000000" w:themeColor="text1"/>
             </w:tcBorders>
@@ -1900,17 +1961,34 @@
         </w:tc>
         <w:tc>
           <w:tcPr>
-            <w:tcW w:w="2835" w:type="dxa"/>
-          </w:tcPr>
-          <w:p>
-            <w:pPr>
-              <w:spacing w:after="0"/>
-            </w:pPr>
-          </w:p>
-        </w:tc>
-        <w:tc>
-          <w:tcPr>
-            <w:tcW w:w="1559" w:type="dxa"/>
+            <w:tcW w:w="2831" w:type="dxa"/>
+          </w:tcPr>
+          <w:p>
+            <w:pPr>
+              <w:spacing w:after="0"/>
+            </w:pPr>
+            <w:r>
+              <w:t xml:space="preserve">Luiz </w:t>
+            </w:r>
+            <w:proofErr w:type="spellStart"/>
+            <w:r>
+              <w:t>Antonio</w:t>
+            </w:r>
+            <w:proofErr w:type="spellEnd"/>
+            <w:r>
+              <w:t xml:space="preserve"> Lopes Junior</w:t>
+            </w:r>
+            <w:r>
+              <w:t xml:space="preserve">, </w:t>
+            </w:r>
+            <w:r>
+              <w:t>Maíra Silva Edo</w:t>
+            </w:r>
+          </w:p>
+        </w:tc>
+        <w:tc>
+          <w:tcPr>
+            <w:tcW w:w="1558" w:type="dxa"/>
           </w:tcPr>
           <w:p>
             <w:pPr>
@@ -1936,7 +2014,7 @@
         </w:tc>
         <w:tc>
           <w:tcPr>
-            <w:tcW w:w="4467" w:type="dxa"/>
+            <w:tcW w:w="4460" w:type="dxa"/>
             <w:tcBorders>
               <w:right w:val="single" w:sz="12" w:space="0" w:color="000000" w:themeColor="text1"/>
             </w:tcBorders>
@@ -1958,8 +2036,13 @@
               <w:t>emplo</w:t>
             </w:r>
             <w:r>
-              <w:t>: Flask</w:t>
-            </w:r>
+              <w:t xml:space="preserve">: </w:t>
+            </w:r>
+            <w:proofErr w:type="spellStart"/>
+            <w:r>
+              <w:t>Flask</w:t>
+            </w:r>
+            <w:proofErr w:type="spellEnd"/>
             <w:r>
               <w:t>, Django)</w:t>
             </w:r>
@@ -1972,7 +2055,7 @@
         </w:trPr>
         <w:tc>
           <w:tcPr>
-            <w:tcW w:w="4390" w:type="dxa"/>
+            <w:tcW w:w="4382" w:type="dxa"/>
             <w:tcBorders>
               <w:left w:val="single" w:sz="12" w:space="0" w:color="000000" w:themeColor="text1"/>
             </w:tcBorders>
@@ -1988,17 +2071,97 @@
         </w:tc>
         <w:tc>
           <w:tcPr>
-            <w:tcW w:w="2835" w:type="dxa"/>
-          </w:tcPr>
-          <w:p>
-            <w:pPr>
-              <w:spacing w:after="0"/>
-            </w:pPr>
-          </w:p>
-        </w:tc>
-        <w:tc>
-          <w:tcPr>
-            <w:tcW w:w="1559" w:type="dxa"/>
+            <w:tcW w:w="2831" w:type="dxa"/>
+          </w:tcPr>
+          <w:p>
+            <w:pPr>
+              <w:spacing w:after="0"/>
+            </w:pPr>
+            <w:r>
+              <w:t>Gilmar Benedito de Souza Junior,</w:t>
+            </w:r>
+          </w:p>
+          <w:p>
+            <w:pPr>
+              <w:spacing w:after="0"/>
+            </w:pPr>
+            <w:proofErr w:type="spellStart"/>
+            <w:r>
+              <w:t>Kaique</w:t>
+            </w:r>
+            <w:proofErr w:type="spellEnd"/>
+            <w:r>
+              <w:t xml:space="preserve"> Lourenço de Andrade,</w:t>
+            </w:r>
+          </w:p>
+          <w:p>
+            <w:pPr>
+              <w:spacing w:after="0"/>
+            </w:pPr>
+            <w:r>
+              <w:t>Larissa de Souza Aguiar,</w:t>
+            </w:r>
+          </w:p>
+          <w:p>
+            <w:pPr>
+              <w:spacing w:after="0"/>
+            </w:pPr>
+            <w:r>
+              <w:t xml:space="preserve">Luiz </w:t>
+            </w:r>
+            <w:proofErr w:type="spellStart"/>
+            <w:r>
+              <w:t>Antonio</w:t>
+            </w:r>
+            <w:proofErr w:type="spellEnd"/>
+            <w:r>
+              <w:t xml:space="preserve"> Lopes Junior,</w:t>
+            </w:r>
+          </w:p>
+          <w:p>
+            <w:pPr>
+              <w:spacing w:after="0"/>
+            </w:pPr>
+            <w:r>
+              <w:t>Maíra Silva Edo,</w:t>
+            </w:r>
+          </w:p>
+          <w:p>
+            <w:pPr>
+              <w:spacing w:after="0"/>
+            </w:pPr>
+            <w:r>
+              <w:t>Mariana dos Reis Silva,</w:t>
+            </w:r>
+          </w:p>
+          <w:p>
+            <w:pPr>
+              <w:spacing w:after="0"/>
+            </w:pPr>
+            <w:r>
+              <w:t>Thiago Augusto Pereira,</w:t>
+            </w:r>
+          </w:p>
+          <w:p>
+            <w:pPr>
+              <w:spacing w:after="0"/>
+            </w:pPr>
+            <w:r>
+              <w:t xml:space="preserve">Wallace </w:t>
+            </w:r>
+            <w:proofErr w:type="spellStart"/>
+            <w:r>
+              <w:t>Eliziario</w:t>
+            </w:r>
+            <w:proofErr w:type="spellEnd"/>
+            <w:r>
+              <w:t xml:space="preserve"> de Souza</w:t>
+            </w:r>
+          </w:p>
+        </w:tc>
+        <w:tc>
+          <w:tcPr>
+            <w:tcW w:w="1558" w:type="dxa"/>
           </w:tcPr>
           <w:p>
             <w:pPr>
@@ -2030,80 +2193,8 @@
         </w:tc>
         <w:tc>
           <w:tcPr>
-            <w:tcW w:w="4467" w:type="dxa"/>
-            <w:tcBorders>
-              <w:right w:val="single" w:sz="12" w:space="0" w:color="000000" w:themeColor="text1"/>
-            </w:tcBorders>
-          </w:tcPr>
-          <w:p>
-            <w:pPr>
-              <w:spacing w:after="0"/>
-            </w:pPr>
-          </w:p>
-        </w:tc>
-      </w:tr>
-      <w:tr>
-        <w:trPr>
-          <w:cantSplit/>
-        </w:trPr>
-        <w:tc>
-          <w:tcPr>
-            <w:tcW w:w="4390" w:type="dxa"/>
-            <w:tcBorders>
-              <w:left w:val="single" w:sz="12" w:space="0" w:color="000000" w:themeColor="text1"/>
-              <w:bottom w:val="single" w:sz="12" w:space="0" w:color="000000" w:themeColor="text1"/>
-            </w:tcBorders>
-          </w:tcPr>
-          <w:p>
-            <w:pPr>
-              <w:spacing w:after="0"/>
-            </w:pPr>
-          </w:p>
-        </w:tc>
-        <w:tc>
-          <w:tcPr>
-            <w:tcW w:w="2835" w:type="dxa"/>
-            <w:tcBorders>
-              <w:bottom w:val="single" w:sz="12" w:space="0" w:color="000000" w:themeColor="text1"/>
-            </w:tcBorders>
-          </w:tcPr>
-          <w:p>
-            <w:pPr>
-              <w:spacing w:after="0"/>
-            </w:pPr>
-          </w:p>
-        </w:tc>
-        <w:tc>
-          <w:tcPr>
-            <w:tcW w:w="1559" w:type="dxa"/>
-            <w:tcBorders>
-              <w:bottom w:val="single" w:sz="12" w:space="0" w:color="000000" w:themeColor="text1"/>
-            </w:tcBorders>
-          </w:tcPr>
-          <w:p>
-            <w:pPr>
-              <w:spacing w:after="0"/>
-            </w:pPr>
-          </w:p>
-        </w:tc>
-        <w:tc>
-          <w:tcPr>
-            <w:tcW w:w="1417" w:type="dxa"/>
-            <w:tcBorders>
-              <w:bottom w:val="single" w:sz="12" w:space="0" w:color="000000" w:themeColor="text1"/>
-            </w:tcBorders>
-          </w:tcPr>
-          <w:p>
-            <w:pPr>
-              <w:spacing w:after="0"/>
-            </w:pPr>
-          </w:p>
-        </w:tc>
-        <w:tc>
-          <w:tcPr>
-            <w:tcW w:w="4467" w:type="dxa"/>
-            <w:tcBorders>
-              <w:bottom w:val="single" w:sz="12" w:space="0" w:color="000000" w:themeColor="text1"/>
+            <w:tcW w:w="4460" w:type="dxa"/>
+            <w:tcBorders>
               <w:right w:val="single" w:sz="12" w:space="0" w:color="000000" w:themeColor="text1"/>
             </w:tcBorders>
           </w:tcPr>
@@ -2119,7 +2210,7 @@
     <w:p/>
     <w:tbl>
       <w:tblPr>
-        <w:tblStyle w:val="TableGrid"/>
+        <w:tblStyle w:val="Tabelacomgrade"/>
         <w:tblW w:w="0" w:type="auto"/>
         <w:tblCellMar>
           <w:top w:w="57" w:type="dxa"/>
@@ -2128,11 +2219,11 @@
         <w:tblLook w:val="04A0" w:firstRow="1" w:lastRow="0" w:firstColumn="1" w:lastColumn="0" w:noHBand="0" w:noVBand="1"/>
       </w:tblPr>
       <w:tblGrid>
-        <w:gridCol w:w="4384"/>
-        <w:gridCol w:w="2831"/>
-        <w:gridCol w:w="1558"/>
-        <w:gridCol w:w="1417"/>
-        <w:gridCol w:w="4458"/>
+        <w:gridCol w:w="2436"/>
+        <w:gridCol w:w="1728"/>
+        <w:gridCol w:w="1412"/>
+        <w:gridCol w:w="1380"/>
+        <w:gridCol w:w="2040"/>
       </w:tblGrid>
       <w:tr>
         <w:trPr>
@@ -2407,7 +2498,84 @@
               <w:spacing w:after="0"/>
             </w:pPr>
             <w:r>
-              <w:t>Todos do grupo</w:t>
+              <w:t>Gilmar Benedito de Souza Junior,</w:t>
+            </w:r>
+          </w:p>
+          <w:p>
+            <w:pPr>
+              <w:spacing w:after="0"/>
+            </w:pPr>
+            <w:proofErr w:type="spellStart"/>
+            <w:r>
+              <w:t>Kaique</w:t>
+            </w:r>
+            <w:proofErr w:type="spellEnd"/>
+            <w:r>
+              <w:t xml:space="preserve"> Lourenço de Andrade,</w:t>
+            </w:r>
+          </w:p>
+          <w:p>
+            <w:pPr>
+              <w:spacing w:after="0"/>
+            </w:pPr>
+            <w:r>
+              <w:t>Larissa de Souza Aguiar,</w:t>
+            </w:r>
+          </w:p>
+          <w:p>
+            <w:pPr>
+              <w:spacing w:after="0"/>
+            </w:pPr>
+            <w:r>
+              <w:t xml:space="preserve">Luiz </w:t>
+            </w:r>
+            <w:proofErr w:type="spellStart"/>
+            <w:r>
+              <w:t>Antonio</w:t>
+            </w:r>
+            <w:proofErr w:type="spellEnd"/>
+            <w:r>
+              <w:t xml:space="preserve"> Lopes Junior,</w:t>
+            </w:r>
+          </w:p>
+          <w:p>
+            <w:pPr>
+              <w:spacing w:after="0"/>
+            </w:pPr>
+            <w:r>
+              <w:t>Maíra Silva Edo,</w:t>
+            </w:r>
+          </w:p>
+          <w:p>
+            <w:pPr>
+              <w:spacing w:after="0"/>
+            </w:pPr>
+            <w:r>
+              <w:t>Mariana dos Reis Silva,</w:t>
+            </w:r>
+          </w:p>
+          <w:p>
+            <w:pPr>
+              <w:spacing w:after="0"/>
+            </w:pPr>
+            <w:r>
+              <w:t>Thiago Augusto Pereira,</w:t>
+            </w:r>
+          </w:p>
+          <w:p>
+            <w:pPr>
+              <w:spacing w:after="0"/>
+            </w:pPr>
+            <w:r>
+              <w:t xml:space="preserve">Wallace </w:t>
+            </w:r>
+            <w:proofErr w:type="spellStart"/>
+            <w:r>
+              <w:t>Eliziario</w:t>
+            </w:r>
+            <w:proofErr w:type="spellEnd"/>
+            <w:r>
+              <w:t xml:space="preserve"> de Souza</w:t>
             </w:r>
           </w:p>
         </w:tc>
@@ -2479,6 +2647,37 @@
             <w:pPr>
               <w:spacing w:after="0"/>
             </w:pPr>
+            <w:r>
+              <w:t>Gilmar Benedito de Souza Junior</w:t>
+            </w:r>
+            <w:r>
+              <w:t xml:space="preserve">, </w:t>
+            </w:r>
+            <w:r>
+              <w:t>Maíra Silva Edo,</w:t>
+            </w:r>
+            <w:r>
+              <w:t xml:space="preserve"> </w:t>
+            </w:r>
+            <w:r>
+              <w:t>Mariana dos Reis Silva,</w:t>
+            </w:r>
+          </w:p>
+          <w:p>
+            <w:pPr>
+              <w:spacing w:after="0"/>
+            </w:pPr>
+            <w:r>
+              <w:t xml:space="preserve">Wallace </w:t>
+            </w:r>
+            <w:proofErr w:type="spellStart"/>
+            <w:r>
+              <w:t>Eliziario</w:t>
+            </w:r>
+            <w:proofErr w:type="spellEnd"/>
+            <w:r>
+              <w:t xml:space="preserve"> de Souza</w:t>
+            </w:r>
           </w:p>
         </w:tc>
         <w:tc>
@@ -2540,6 +2739,7 @@
               <w:spacing w:after="0"/>
             </w:pPr>
             <w:r>
+              <w:lastRenderedPageBreak/>
               <w:t>Estruturar o plano de desenvolvimento do sistema</w:t>
             </w:r>
           </w:p>
@@ -2552,6 +2752,28 @@
             <w:pPr>
               <w:spacing w:after="0"/>
             </w:pPr>
+            <w:r>
+              <w:t xml:space="preserve">Luiz </w:t>
+            </w:r>
+            <w:proofErr w:type="spellStart"/>
+            <w:r>
+              <w:t>Antonio</w:t>
+            </w:r>
+            <w:proofErr w:type="spellEnd"/>
+            <w:r>
+              <w:t xml:space="preserve"> Lopes Junior</w:t>
+            </w:r>
+            <w:r>
+              <w:t xml:space="preserve">, </w:t>
+            </w:r>
+            <w:proofErr w:type="spellStart"/>
+            <w:r>
+              <w:t>Kaique</w:t>
+            </w:r>
+            <w:proofErr w:type="spellEnd"/>
+            <w:r>
+              <w:t xml:space="preserve"> Lourenço de Andrade</w:t>
+            </w:r>
           </w:p>
         </w:tc>
         <w:tc>
@@ -2682,7 +2904,7 @@
     <w:p/>
     <w:tbl>
       <w:tblPr>
-        <w:tblStyle w:val="TableGrid"/>
+        <w:tblStyle w:val="Tabelacomgrade"/>
         <w:tblW w:w="0" w:type="auto"/>
         <w:tblCellMar>
           <w:top w:w="57" w:type="dxa"/>
@@ -2691,11 +2913,11 @@
         <w:tblLook w:val="04A0" w:firstRow="1" w:lastRow="0" w:firstColumn="1" w:lastColumn="0" w:noHBand="0" w:noVBand="1"/>
       </w:tblPr>
       <w:tblGrid>
-        <w:gridCol w:w="4383"/>
-        <w:gridCol w:w="2831"/>
-        <w:gridCol w:w="1558"/>
-        <w:gridCol w:w="1417"/>
-        <w:gridCol w:w="4459"/>
+        <w:gridCol w:w="2399"/>
+        <w:gridCol w:w="1707"/>
+        <w:gridCol w:w="1409"/>
+        <w:gridCol w:w="1380"/>
+        <w:gridCol w:w="2101"/>
       </w:tblGrid>
       <w:tr>
         <w:trPr>
@@ -2705,7 +2927,7 @@
         </w:trPr>
         <w:tc>
           <w:tcPr>
-            <w:tcW w:w="14668" w:type="dxa"/>
+            <w:tcW w:w="14648" w:type="dxa"/>
             <w:gridSpan w:val="5"/>
             <w:tcBorders>
               <w:top w:val="single" w:sz="12" w:space="0" w:color="000000" w:themeColor="text1"/>
@@ -2785,7 +3007,7 @@
         </w:trPr>
         <w:tc>
           <w:tcPr>
-            <w:tcW w:w="4390" w:type="dxa"/>
+            <w:tcW w:w="4383" w:type="dxa"/>
             <w:tcBorders>
               <w:top w:val="single" w:sz="2" w:space="0" w:color="auto"/>
               <w:left w:val="single" w:sz="12" w:space="0" w:color="000000" w:themeColor="text1"/>
@@ -2804,7 +3026,7 @@
         </w:tc>
         <w:tc>
           <w:tcPr>
-            <w:tcW w:w="2835" w:type="dxa"/>
+            <w:tcW w:w="2831" w:type="dxa"/>
             <w:tcBorders>
               <w:top w:val="single" w:sz="2" w:space="0" w:color="auto"/>
             </w:tcBorders>
@@ -2822,7 +3044,7 @@
         </w:tc>
         <w:tc>
           <w:tcPr>
-            <w:tcW w:w="1559" w:type="dxa"/>
+            <w:tcW w:w="1558" w:type="dxa"/>
             <w:tcBorders>
               <w:top w:val="single" w:sz="2" w:space="0" w:color="auto"/>
             </w:tcBorders>
@@ -2858,7 +3080,7 @@
         </w:tc>
         <w:tc>
           <w:tcPr>
-            <w:tcW w:w="4467" w:type="dxa"/>
+            <w:tcW w:w="4459" w:type="dxa"/>
             <w:tcBorders>
               <w:top w:val="single" w:sz="2" w:space="0" w:color="auto"/>
               <w:right w:val="single" w:sz="12" w:space="0" w:color="000000" w:themeColor="text1"/>
@@ -2882,7 +3104,7 @@
         </w:trPr>
         <w:tc>
           <w:tcPr>
-            <w:tcW w:w="4390" w:type="dxa"/>
+            <w:tcW w:w="4383" w:type="dxa"/>
             <w:tcBorders>
               <w:left w:val="single" w:sz="12" w:space="0" w:color="000000" w:themeColor="text1"/>
             </w:tcBorders>
@@ -2898,17 +3120,97 @@
         </w:tc>
         <w:tc>
           <w:tcPr>
-            <w:tcW w:w="2835" w:type="dxa"/>
-          </w:tcPr>
-          <w:p>
-            <w:pPr>
-              <w:spacing w:after="0"/>
-            </w:pPr>
-          </w:p>
-        </w:tc>
-        <w:tc>
-          <w:tcPr>
-            <w:tcW w:w="1559" w:type="dxa"/>
+            <w:tcW w:w="2831" w:type="dxa"/>
+          </w:tcPr>
+          <w:p>
+            <w:pPr>
+              <w:spacing w:after="0"/>
+            </w:pPr>
+            <w:r>
+              <w:t>Gilmar Benedito de Souza Junior,</w:t>
+            </w:r>
+          </w:p>
+          <w:p>
+            <w:pPr>
+              <w:spacing w:after="0"/>
+            </w:pPr>
+            <w:proofErr w:type="spellStart"/>
+            <w:r>
+              <w:t>Kaique</w:t>
+            </w:r>
+            <w:proofErr w:type="spellEnd"/>
+            <w:r>
+              <w:t xml:space="preserve"> Lourenço de Andrade,</w:t>
+            </w:r>
+          </w:p>
+          <w:p>
+            <w:pPr>
+              <w:spacing w:after="0"/>
+            </w:pPr>
+            <w:r>
+              <w:t>Larissa de Souza Aguiar,</w:t>
+            </w:r>
+          </w:p>
+          <w:p>
+            <w:pPr>
+              <w:spacing w:after="0"/>
+            </w:pPr>
+            <w:r>
+              <w:t xml:space="preserve">Luiz </w:t>
+            </w:r>
+            <w:proofErr w:type="spellStart"/>
+            <w:r>
+              <w:t>Antonio</w:t>
+            </w:r>
+            <w:proofErr w:type="spellEnd"/>
+            <w:r>
+              <w:t xml:space="preserve"> Lopes Junior,</w:t>
+            </w:r>
+          </w:p>
+          <w:p>
+            <w:pPr>
+              <w:spacing w:after="0"/>
+            </w:pPr>
+            <w:r>
+              <w:t>Maíra Silva Edo,</w:t>
+            </w:r>
+          </w:p>
+          <w:p>
+            <w:pPr>
+              <w:spacing w:after="0"/>
+            </w:pPr>
+            <w:r>
+              <w:t>Mariana dos Reis Silva,</w:t>
+            </w:r>
+          </w:p>
+          <w:p>
+            <w:pPr>
+              <w:spacing w:after="0"/>
+            </w:pPr>
+            <w:r>
+              <w:t>Thiago Augusto Pereira,</w:t>
+            </w:r>
+          </w:p>
+          <w:p>
+            <w:pPr>
+              <w:spacing w:after="0"/>
+            </w:pPr>
+            <w:r>
+              <w:t xml:space="preserve">Wallace </w:t>
+            </w:r>
+            <w:proofErr w:type="spellStart"/>
+            <w:r>
+              <w:t>Eliziario</w:t>
+            </w:r>
+            <w:proofErr w:type="spellEnd"/>
+            <w:r>
+              <w:t xml:space="preserve"> de Souza</w:t>
+            </w:r>
+          </w:p>
+        </w:tc>
+        <w:tc>
+          <w:tcPr>
+            <w:tcW w:w="1558" w:type="dxa"/>
           </w:tcPr>
           <w:p>
             <w:pPr>
@@ -2934,7 +3236,7 @@
         </w:tc>
         <w:tc>
           <w:tcPr>
-            <w:tcW w:w="4467" w:type="dxa"/>
+            <w:tcW w:w="4459" w:type="dxa"/>
             <w:tcBorders>
               <w:right w:val="single" w:sz="12" w:space="0" w:color="000000" w:themeColor="text1"/>
             </w:tcBorders>
@@ -2952,7 +3254,7 @@
         </w:trPr>
         <w:tc>
           <w:tcPr>
-            <w:tcW w:w="4390" w:type="dxa"/>
+            <w:tcW w:w="4383" w:type="dxa"/>
             <w:tcBorders>
               <w:left w:val="single" w:sz="12" w:space="0" w:color="000000" w:themeColor="text1"/>
             </w:tcBorders>
@@ -2962,13 +3264,14 @@
               <w:spacing w:after="0"/>
             </w:pPr>
             <w:r>
+              <w:lastRenderedPageBreak/>
               <w:t>Realizar visita ou contato com a empresa para validação da proposta</w:t>
             </w:r>
           </w:p>
         </w:tc>
         <w:tc>
           <w:tcPr>
-            <w:tcW w:w="2835" w:type="dxa"/>
+            <w:tcW w:w="2831" w:type="dxa"/>
           </w:tcPr>
           <w:p>
             <w:pPr>
@@ -2981,7 +3284,7 @@
         </w:tc>
         <w:tc>
           <w:tcPr>
-            <w:tcW w:w="1559" w:type="dxa"/>
+            <w:tcW w:w="1558" w:type="dxa"/>
           </w:tcPr>
           <w:p>
             <w:pPr>
@@ -3007,7 +3310,7 @@
         </w:tc>
         <w:tc>
           <w:tcPr>
-            <w:tcW w:w="4467" w:type="dxa"/>
+            <w:tcW w:w="4459" w:type="dxa"/>
             <w:tcBorders>
               <w:right w:val="single" w:sz="12" w:space="0" w:color="000000" w:themeColor="text1"/>
             </w:tcBorders>
@@ -3025,7 +3328,7 @@
         </w:trPr>
         <w:tc>
           <w:tcPr>
-            <w:tcW w:w="4390" w:type="dxa"/>
+            <w:tcW w:w="4383" w:type="dxa"/>
             <w:tcBorders>
               <w:left w:val="single" w:sz="12" w:space="0" w:color="000000" w:themeColor="text1"/>
             </w:tcBorders>
@@ -3035,24 +3338,58 @@
               <w:spacing w:after="0"/>
             </w:pPr>
             <w:r>
-              <w:lastRenderedPageBreak/>
               <w:t>Iniciar o desenvolvimento técnico</w:t>
             </w:r>
           </w:p>
         </w:tc>
         <w:tc>
           <w:tcPr>
-            <w:tcW w:w="2835" w:type="dxa"/>
-          </w:tcPr>
-          <w:p>
-            <w:pPr>
-              <w:spacing w:after="0"/>
-            </w:pPr>
-          </w:p>
-        </w:tc>
-        <w:tc>
-          <w:tcPr>
-            <w:tcW w:w="1559" w:type="dxa"/>
+            <w:tcW w:w="2831" w:type="dxa"/>
+          </w:tcPr>
+          <w:p>
+            <w:pPr>
+              <w:spacing w:after="0"/>
+            </w:pPr>
+            <w:r>
+              <w:t>Gilmar Benedito de Souza Junior,</w:t>
+            </w:r>
+          </w:p>
+          <w:p>
+            <w:pPr>
+              <w:spacing w:after="0"/>
+            </w:pPr>
+            <w:proofErr w:type="spellStart"/>
+            <w:r>
+              <w:t>Kaique</w:t>
+            </w:r>
+            <w:proofErr w:type="spellEnd"/>
+            <w:r>
+              <w:t xml:space="preserve"> Lourenço de Andrade,</w:t>
+            </w:r>
+          </w:p>
+          <w:p>
+            <w:pPr>
+              <w:spacing w:after="0"/>
+            </w:pPr>
+            <w:r>
+              <w:t>Larissa de Souza Aguiar</w:t>
+            </w:r>
+            <w:r>
+              <w:t xml:space="preserve">, </w:t>
+            </w:r>
+            <w:r>
+              <w:t>Maíra Silva Edo</w:t>
+            </w:r>
+          </w:p>
+          <w:p>
+            <w:pPr>
+              <w:spacing w:after="0"/>
+            </w:pPr>
+          </w:p>
+        </w:tc>
+        <w:tc>
+          <w:tcPr>
+            <w:tcW w:w="1558" w:type="dxa"/>
           </w:tcPr>
           <w:p>
             <w:pPr>
@@ -3078,7 +3415,7 @@
         </w:tc>
         <w:tc>
           <w:tcPr>
-            <w:tcW w:w="4467" w:type="dxa"/>
+            <w:tcW w:w="4459" w:type="dxa"/>
             <w:tcBorders>
               <w:right w:val="single" w:sz="12" w:space="0" w:color="000000" w:themeColor="text1"/>
             </w:tcBorders>
@@ -3105,7 +3442,7 @@
         </w:trPr>
         <w:tc>
           <w:tcPr>
-            <w:tcW w:w="4390" w:type="dxa"/>
+            <w:tcW w:w="4383" w:type="dxa"/>
             <w:tcBorders>
               <w:left w:val="single" w:sz="12" w:space="0" w:color="000000" w:themeColor="text1"/>
             </w:tcBorders>
@@ -3115,23 +3452,77 @@
               <w:spacing w:after="0"/>
             </w:pPr>
             <w:r>
-              <w:t>Iniciar desenvolvimento do backend em Python</w:t>
-            </w:r>
-          </w:p>
-        </w:tc>
-        <w:tc>
-          <w:tcPr>
-            <w:tcW w:w="2835" w:type="dxa"/>
-          </w:tcPr>
-          <w:p>
-            <w:pPr>
-              <w:spacing w:after="0"/>
-            </w:pPr>
-          </w:p>
-        </w:tc>
-        <w:tc>
-          <w:tcPr>
-            <w:tcW w:w="1559" w:type="dxa"/>
+              <w:t xml:space="preserve">Iniciar desenvolvimento do </w:t>
+            </w:r>
+            <w:proofErr w:type="spellStart"/>
+            <w:r>
+              <w:t>backend</w:t>
+            </w:r>
+            <w:proofErr w:type="spellEnd"/>
+            <w:r>
+              <w:t xml:space="preserve"> em Python</w:t>
+            </w:r>
+          </w:p>
+        </w:tc>
+        <w:tc>
+          <w:tcPr>
+            <w:tcW w:w="2831" w:type="dxa"/>
+          </w:tcPr>
+          <w:p>
+            <w:pPr>
+              <w:spacing w:after="0"/>
+            </w:pPr>
+            <w:r>
+              <w:t xml:space="preserve">Luiz </w:t>
+            </w:r>
+            <w:proofErr w:type="spellStart"/>
+            <w:r>
+              <w:t>Antonio</w:t>
+            </w:r>
+            <w:proofErr w:type="spellEnd"/>
+            <w:r>
+              <w:t xml:space="preserve"> Lopes Junior</w:t>
+            </w:r>
+            <w:r>
+              <w:t xml:space="preserve">, </w:t>
+            </w:r>
+          </w:p>
+          <w:p>
+            <w:pPr>
+              <w:spacing w:after="0"/>
+            </w:pPr>
+            <w:r>
+              <w:t>Mariana dos Reis Silva,</w:t>
+            </w:r>
+          </w:p>
+          <w:p>
+            <w:pPr>
+              <w:spacing w:after="0"/>
+            </w:pPr>
+            <w:r>
+              <w:t>Thiago Augusto Pereira,</w:t>
+            </w:r>
+          </w:p>
+          <w:p>
+            <w:pPr>
+              <w:spacing w:after="0"/>
+            </w:pPr>
+            <w:r>
+              <w:t xml:space="preserve">Wallace </w:t>
+            </w:r>
+            <w:proofErr w:type="spellStart"/>
+            <w:r>
+              <w:t>Eliziario</w:t>
+            </w:r>
+            <w:proofErr w:type="spellEnd"/>
+            <w:r>
+              <w:t xml:space="preserve"> de Souza</w:t>
+            </w:r>
+          </w:p>
+        </w:tc>
+        <w:tc>
+          <w:tcPr>
+            <w:tcW w:w="1558" w:type="dxa"/>
           </w:tcPr>
           <w:p>
             <w:pPr>
@@ -3157,80 +3548,8 @@
         </w:tc>
         <w:tc>
           <w:tcPr>
-            <w:tcW w:w="4467" w:type="dxa"/>
-            <w:tcBorders>
-              <w:right w:val="single" w:sz="12" w:space="0" w:color="000000" w:themeColor="text1"/>
-            </w:tcBorders>
-          </w:tcPr>
-          <w:p>
-            <w:pPr>
-              <w:spacing w:after="0"/>
-            </w:pPr>
-          </w:p>
-        </w:tc>
-      </w:tr>
-      <w:tr>
-        <w:trPr>
-          <w:cantSplit/>
-        </w:trPr>
-        <w:tc>
-          <w:tcPr>
-            <w:tcW w:w="4390" w:type="dxa"/>
-            <w:tcBorders>
-              <w:left w:val="single" w:sz="12" w:space="0" w:color="000000" w:themeColor="text1"/>
-              <w:bottom w:val="single" w:sz="12" w:space="0" w:color="000000" w:themeColor="text1"/>
-            </w:tcBorders>
-          </w:tcPr>
-          <w:p>
-            <w:pPr>
-              <w:spacing w:after="0"/>
-            </w:pPr>
-          </w:p>
-        </w:tc>
-        <w:tc>
-          <w:tcPr>
-            <w:tcW w:w="2835" w:type="dxa"/>
-            <w:tcBorders>
-              <w:bottom w:val="single" w:sz="12" w:space="0" w:color="000000" w:themeColor="text1"/>
-            </w:tcBorders>
-          </w:tcPr>
-          <w:p>
-            <w:pPr>
-              <w:spacing w:after="0"/>
-            </w:pPr>
-          </w:p>
-        </w:tc>
-        <w:tc>
-          <w:tcPr>
-            <w:tcW w:w="1559" w:type="dxa"/>
-            <w:tcBorders>
-              <w:bottom w:val="single" w:sz="12" w:space="0" w:color="000000" w:themeColor="text1"/>
-            </w:tcBorders>
-          </w:tcPr>
-          <w:p>
-            <w:pPr>
-              <w:spacing w:after="0"/>
-            </w:pPr>
-          </w:p>
-        </w:tc>
-        <w:tc>
-          <w:tcPr>
-            <w:tcW w:w="1417" w:type="dxa"/>
-            <w:tcBorders>
-              <w:bottom w:val="single" w:sz="12" w:space="0" w:color="000000" w:themeColor="text1"/>
-            </w:tcBorders>
-          </w:tcPr>
-          <w:p>
-            <w:pPr>
-              <w:spacing w:after="0"/>
-            </w:pPr>
-          </w:p>
-        </w:tc>
-        <w:tc>
-          <w:tcPr>
-            <w:tcW w:w="4467" w:type="dxa"/>
-            <w:tcBorders>
-              <w:bottom w:val="single" w:sz="12" w:space="0" w:color="000000" w:themeColor="text1"/>
+            <w:tcW w:w="4459" w:type="dxa"/>
+            <w:tcBorders>
               <w:right w:val="single" w:sz="12" w:space="0" w:color="000000" w:themeColor="text1"/>
             </w:tcBorders>
           </w:tcPr>
@@ -3245,7 +3564,7 @@
     <w:p/>
     <w:tbl>
       <w:tblPr>
-        <w:tblStyle w:val="TableGrid"/>
+        <w:tblStyle w:val="Tabelacomgrade"/>
         <w:tblW w:w="0" w:type="auto"/>
         <w:tblCellMar>
           <w:top w:w="57" w:type="dxa"/>
@@ -3254,11 +3573,11 @@
         <w:tblLook w:val="04A0" w:firstRow="1" w:lastRow="0" w:firstColumn="1" w:lastColumn="0" w:noHBand="0" w:noVBand="1"/>
       </w:tblPr>
       <w:tblGrid>
-        <w:gridCol w:w="4383"/>
-        <w:gridCol w:w="2831"/>
-        <w:gridCol w:w="1558"/>
-        <w:gridCol w:w="1417"/>
-        <w:gridCol w:w="4459"/>
+        <w:gridCol w:w="2377"/>
+        <w:gridCol w:w="1745"/>
+        <w:gridCol w:w="1414"/>
+        <w:gridCol w:w="1381"/>
+        <w:gridCol w:w="2079"/>
       </w:tblGrid>
       <w:tr>
         <w:trPr>
@@ -3299,6 +3618,7 @@
                 <w:sz w:val="28"/>
                 <w:szCs w:val="28"/>
               </w:rPr>
+              <w:lastRenderedPageBreak/>
               <w:t xml:space="preserve">Quinzena </w:t>
             </w:r>
             <w:r>
@@ -3481,6 +3801,34 @@
             <w:pPr>
               <w:spacing w:after="0"/>
             </w:pPr>
+            <w:proofErr w:type="spellStart"/>
+            <w:r>
+              <w:t>Kaique</w:t>
+            </w:r>
+            <w:proofErr w:type="spellEnd"/>
+            <w:r>
+              <w:t xml:space="preserve"> Lourenço de Andrade</w:t>
+            </w:r>
+            <w:r>
+              <w:t xml:space="preserve">, </w:t>
+            </w:r>
+            <w:r>
+              <w:t xml:space="preserve">Luiz </w:t>
+            </w:r>
+            <w:proofErr w:type="spellStart"/>
+            <w:r>
+              <w:t>Antonio</w:t>
+            </w:r>
+            <w:proofErr w:type="spellEnd"/>
+            <w:r>
+              <w:t xml:space="preserve"> Lopes Junior</w:t>
+            </w:r>
+            <w:r>
+              <w:t xml:space="preserve">, </w:t>
+            </w:r>
+            <w:r>
+              <w:t>Mariana dos Reis Silva</w:t>
+            </w:r>
           </w:p>
         </w:tc>
         <w:tc>
@@ -3563,6 +3911,21 @@
             <w:pPr>
               <w:spacing w:after="0"/>
             </w:pPr>
+            <w:r>
+              <w:t>Larissa de Souza Aguiar</w:t>
+            </w:r>
+            <w:r>
+              <w:t xml:space="preserve">, </w:t>
+            </w:r>
+            <w:r>
+              <w:t>Maíra Silva Edo</w:t>
+            </w:r>
+            <w:r>
+              <w:t xml:space="preserve">, </w:t>
+            </w:r>
+            <w:r>
+              <w:t>Mariana dos Reis Silva</w:t>
+            </w:r>
           </w:p>
         </w:tc>
         <w:tc>
@@ -3633,6 +3996,15 @@
             <w:pPr>
               <w:spacing w:after="0"/>
             </w:pPr>
+            <w:r>
+              <w:t>Gilmar Benedito de Souza Junior</w:t>
+            </w:r>
+            <w:r>
+              <w:t xml:space="preserve">, </w:t>
+            </w:r>
+            <w:r>
+              <w:t>Larissa de Souza Aguiar</w:t>
+            </w:r>
           </w:p>
         </w:tc>
         <w:tc>
@@ -3703,6 +4075,9 @@
             <w:pPr>
               <w:spacing w:after="0"/>
             </w:pPr>
+            <w:r>
+              <w:t>Maíra Silva Edo</w:t>
+            </w:r>
           </w:p>
         </w:tc>
         <w:tc>
@@ -3774,7 +4149,6 @@
               <w:spacing w:after="0"/>
             </w:pPr>
             <w:r>
-              <w:lastRenderedPageBreak/>
               <w:t>Elaborar e entregar o Relatório Parcial</w:t>
             </w:r>
           </w:p>
@@ -3790,6 +4164,34 @@
             <w:pPr>
               <w:spacing w:after="0"/>
             </w:pPr>
+            <w:proofErr w:type="spellStart"/>
+            <w:r>
+              <w:t>Kaique</w:t>
+            </w:r>
+            <w:proofErr w:type="spellEnd"/>
+            <w:r>
+              <w:t xml:space="preserve"> Lourenço de Andrade</w:t>
+            </w:r>
+            <w:r>
+              <w:t xml:space="preserve">, </w:t>
+            </w:r>
+            <w:r>
+              <w:t>Thiago Augusto Pereira</w:t>
+            </w:r>
+            <w:r>
+              <w:t xml:space="preserve">, </w:t>
+            </w:r>
+            <w:r>
+              <w:t xml:space="preserve">Wallace </w:t>
+            </w:r>
+            <w:proofErr w:type="spellStart"/>
+            <w:r>
+              <w:t>Eliziario</w:t>
+            </w:r>
+            <w:proofErr w:type="spellEnd"/>
+            <w:r>
+              <w:t xml:space="preserve"> de Souza</w:t>
+            </w:r>
           </w:p>
         </w:tc>
         <w:tc>
@@ -3843,7 +4245,7 @@
     <w:p/>
     <w:tbl>
       <w:tblPr>
-        <w:tblStyle w:val="TableGrid"/>
+        <w:tblStyle w:val="Tabelacomgrade"/>
         <w:tblW w:w="0" w:type="auto"/>
         <w:tblCellMar>
           <w:top w:w="57" w:type="dxa"/>
@@ -3852,11 +4254,11 @@
         <w:tblLook w:val="04A0" w:firstRow="1" w:lastRow="0" w:firstColumn="1" w:lastColumn="0" w:noHBand="0" w:noVBand="1"/>
       </w:tblPr>
       <w:tblGrid>
-        <w:gridCol w:w="4383"/>
-        <w:gridCol w:w="2831"/>
-        <w:gridCol w:w="1558"/>
-        <w:gridCol w:w="1417"/>
-        <w:gridCol w:w="4459"/>
+        <w:gridCol w:w="2310"/>
+        <w:gridCol w:w="1709"/>
+        <w:gridCol w:w="1409"/>
+        <w:gridCol w:w="1380"/>
+        <w:gridCol w:w="2188"/>
       </w:tblGrid>
       <w:tr>
         <w:trPr>
@@ -3866,7 +4268,7 @@
         </w:trPr>
         <w:tc>
           <w:tcPr>
-            <w:tcW w:w="14668" w:type="dxa"/>
+            <w:tcW w:w="14648" w:type="dxa"/>
             <w:gridSpan w:val="5"/>
             <w:tcBorders>
               <w:top w:val="single" w:sz="12" w:space="0" w:color="000000" w:themeColor="text1"/>
@@ -3897,6 +4299,7 @@
                 <w:sz w:val="28"/>
                 <w:szCs w:val="28"/>
               </w:rPr>
+              <w:lastRenderedPageBreak/>
               <w:t xml:space="preserve">Quinzena </w:t>
             </w:r>
             <w:r>
@@ -3974,7 +4377,7 @@
         </w:trPr>
         <w:tc>
           <w:tcPr>
-            <w:tcW w:w="4390" w:type="dxa"/>
+            <w:tcW w:w="4383" w:type="dxa"/>
             <w:tcBorders>
               <w:top w:val="single" w:sz="2" w:space="0" w:color="auto"/>
               <w:left w:val="single" w:sz="12" w:space="0" w:color="000000" w:themeColor="text1"/>
@@ -3993,7 +4396,7 @@
         </w:tc>
         <w:tc>
           <w:tcPr>
-            <w:tcW w:w="2835" w:type="dxa"/>
+            <w:tcW w:w="2831" w:type="dxa"/>
             <w:tcBorders>
               <w:top w:val="single" w:sz="2" w:space="0" w:color="auto"/>
             </w:tcBorders>
@@ -4011,7 +4414,7 @@
         </w:tc>
         <w:tc>
           <w:tcPr>
-            <w:tcW w:w="1559" w:type="dxa"/>
+            <w:tcW w:w="1558" w:type="dxa"/>
             <w:tcBorders>
               <w:top w:val="single" w:sz="2" w:space="0" w:color="auto"/>
             </w:tcBorders>
@@ -4047,7 +4450,7 @@
         </w:tc>
         <w:tc>
           <w:tcPr>
-            <w:tcW w:w="4467" w:type="dxa"/>
+            <w:tcW w:w="4459" w:type="dxa"/>
             <w:tcBorders>
               <w:top w:val="single" w:sz="2" w:space="0" w:color="auto"/>
               <w:right w:val="single" w:sz="12" w:space="0" w:color="000000" w:themeColor="text1"/>
@@ -4071,7 +4474,7 @@
         </w:trPr>
         <w:tc>
           <w:tcPr>
-            <w:tcW w:w="4390" w:type="dxa"/>
+            <w:tcW w:w="4383" w:type="dxa"/>
             <w:tcBorders>
               <w:left w:val="single" w:sz="12" w:space="0" w:color="000000" w:themeColor="text1"/>
             </w:tcBorders>
@@ -4087,17 +4490,42 @@
         </w:tc>
         <w:tc>
           <w:tcPr>
-            <w:tcW w:w="2835" w:type="dxa"/>
-          </w:tcPr>
-          <w:p>
-            <w:pPr>
-              <w:spacing w:after="0"/>
-            </w:pPr>
-          </w:p>
-        </w:tc>
-        <w:tc>
-          <w:tcPr>
-            <w:tcW w:w="1559" w:type="dxa"/>
+            <w:tcW w:w="2831" w:type="dxa"/>
+          </w:tcPr>
+          <w:p>
+            <w:pPr>
+              <w:spacing w:after="0"/>
+            </w:pPr>
+            <w:r>
+              <w:t>Gilmar Benedito de Souza Junior,</w:t>
+            </w:r>
+          </w:p>
+          <w:p>
+            <w:pPr>
+              <w:spacing w:after="0"/>
+            </w:pPr>
+            <w:r>
+              <w:t>Mariana dos Reis Silva</w:t>
+            </w:r>
+            <w:r>
+              <w:t xml:space="preserve">, </w:t>
+            </w:r>
+            <w:r>
+              <w:t xml:space="preserve">Wallace </w:t>
+            </w:r>
+            <w:proofErr w:type="spellStart"/>
+            <w:r>
+              <w:t>Eliziario</w:t>
+            </w:r>
+            <w:proofErr w:type="spellEnd"/>
+            <w:r>
+              <w:t xml:space="preserve"> de Souza</w:t>
+            </w:r>
+          </w:p>
+        </w:tc>
+        <w:tc>
+          <w:tcPr>
+            <w:tcW w:w="1558" w:type="dxa"/>
           </w:tcPr>
           <w:p>
             <w:pPr>
@@ -4123,7 +4551,7 @@
         </w:tc>
         <w:tc>
           <w:tcPr>
-            <w:tcW w:w="4467" w:type="dxa"/>
+            <w:tcW w:w="4459" w:type="dxa"/>
             <w:tcBorders>
               <w:right w:val="single" w:sz="12" w:space="0" w:color="000000" w:themeColor="text1"/>
             </w:tcBorders>
@@ -4141,7 +4569,7 @@
         </w:trPr>
         <w:tc>
           <w:tcPr>
-            <w:tcW w:w="4390" w:type="dxa"/>
+            <w:tcW w:w="4383" w:type="dxa"/>
             <w:tcBorders>
               <w:left w:val="single" w:sz="12" w:space="0" w:color="000000" w:themeColor="text1"/>
             </w:tcBorders>
@@ -4157,17 +4585,60 @@
         </w:tc>
         <w:tc>
           <w:tcPr>
-            <w:tcW w:w="2835" w:type="dxa"/>
-          </w:tcPr>
-          <w:p>
-            <w:pPr>
-              <w:spacing w:after="0"/>
-            </w:pPr>
-          </w:p>
-        </w:tc>
-        <w:tc>
-          <w:tcPr>
-            <w:tcW w:w="1559" w:type="dxa"/>
+            <w:tcW w:w="2831" w:type="dxa"/>
+          </w:tcPr>
+          <w:p>
+            <w:pPr>
+              <w:spacing w:after="0"/>
+            </w:pPr>
+            <w:proofErr w:type="spellStart"/>
+            <w:r>
+              <w:t>Kaique</w:t>
+            </w:r>
+            <w:proofErr w:type="spellEnd"/>
+            <w:r>
+              <w:t xml:space="preserve"> Lourenço de Andrade,</w:t>
+            </w:r>
+          </w:p>
+          <w:p>
+            <w:pPr>
+              <w:spacing w:after="0"/>
+            </w:pPr>
+            <w:r>
+              <w:t>Larissa de Souza Aguiar,</w:t>
+            </w:r>
+          </w:p>
+          <w:p>
+            <w:pPr>
+              <w:spacing w:after="0"/>
+            </w:pPr>
+            <w:r>
+              <w:t xml:space="preserve">Luiz </w:t>
+            </w:r>
+            <w:proofErr w:type="spellStart"/>
+            <w:r>
+              <w:t>Antonio</w:t>
+            </w:r>
+            <w:proofErr w:type="spellEnd"/>
+            <w:r>
+              <w:t xml:space="preserve"> Lopes Junior</w:t>
+            </w:r>
+            <w:r>
+              <w:t>,</w:t>
+            </w:r>
+          </w:p>
+          <w:p>
+            <w:pPr>
+              <w:spacing w:after="0"/>
+            </w:pPr>
+            <w:r>
+              <w:t>Maíra Silva Edo</w:t>
+            </w:r>
+          </w:p>
+        </w:tc>
+        <w:tc>
+          <w:tcPr>
+            <w:tcW w:w="1558" w:type="dxa"/>
           </w:tcPr>
           <w:p>
             <w:pPr>
@@ -4193,7 +4664,7 @@
         </w:tc>
         <w:tc>
           <w:tcPr>
-            <w:tcW w:w="4467" w:type="dxa"/>
+            <w:tcW w:w="4459" w:type="dxa"/>
             <w:tcBorders>
               <w:right w:val="single" w:sz="12" w:space="0" w:color="000000" w:themeColor="text1"/>
             </w:tcBorders>
@@ -4209,7 +4680,10 @@
               <w:t xml:space="preserve">, </w:t>
             </w:r>
             <w:r>
-              <w:t>Excluir cliente</w:t>
+              <w:t>excluir</w:t>
+            </w:r>
+            <w:r>
+              <w:t xml:space="preserve"> cliente</w:t>
             </w:r>
             <w:r>
               <w:t>, Perfil de login de administrador</w:t>
@@ -4223,7 +4697,7 @@
         </w:trPr>
         <w:tc>
           <w:tcPr>
-            <w:tcW w:w="4390" w:type="dxa"/>
+            <w:tcW w:w="4383" w:type="dxa"/>
             <w:tcBorders>
               <w:left w:val="single" w:sz="12" w:space="0" w:color="000000" w:themeColor="text1"/>
             </w:tcBorders>
@@ -4239,17 +4713,32 @@
         </w:tc>
         <w:tc>
           <w:tcPr>
-            <w:tcW w:w="2835" w:type="dxa"/>
-          </w:tcPr>
-          <w:p>
-            <w:pPr>
-              <w:spacing w:after="0"/>
-            </w:pPr>
-          </w:p>
-        </w:tc>
-        <w:tc>
-          <w:tcPr>
-            <w:tcW w:w="1559" w:type="dxa"/>
+            <w:tcW w:w="2831" w:type="dxa"/>
+          </w:tcPr>
+          <w:p>
+            <w:pPr>
+              <w:spacing w:after="0"/>
+            </w:pPr>
+            <w:r>
+              <w:t>Larissa de Souza Aguiar</w:t>
+            </w:r>
+            <w:r>
+              <w:t xml:space="preserve">, </w:t>
+            </w:r>
+            <w:r>
+              <w:t>Maíra Silva Edo</w:t>
+            </w:r>
+            <w:r>
+              <w:t xml:space="preserve">, </w:t>
+            </w:r>
+            <w:r>
+              <w:t>Mariana dos Reis Silva</w:t>
+            </w:r>
+          </w:p>
+        </w:tc>
+        <w:tc>
+          <w:tcPr>
+            <w:tcW w:w="1558" w:type="dxa"/>
           </w:tcPr>
           <w:p>
             <w:pPr>
@@ -4275,7 +4764,7 @@
         </w:tc>
         <w:tc>
           <w:tcPr>
-            <w:tcW w:w="4467" w:type="dxa"/>
+            <w:tcW w:w="4459" w:type="dxa"/>
             <w:tcBorders>
               <w:right w:val="single" w:sz="12" w:space="0" w:color="000000" w:themeColor="text1"/>
             </w:tcBorders>
@@ -4293,7 +4782,7 @@
         </w:trPr>
         <w:tc>
           <w:tcPr>
-            <w:tcW w:w="4390" w:type="dxa"/>
+            <w:tcW w:w="4383" w:type="dxa"/>
             <w:tcBorders>
               <w:left w:val="single" w:sz="12" w:space="0" w:color="000000" w:themeColor="text1"/>
             </w:tcBorders>
@@ -4315,17 +4804,72 @@
         </w:tc>
         <w:tc>
           <w:tcPr>
-            <w:tcW w:w="2835" w:type="dxa"/>
-          </w:tcPr>
-          <w:p>
-            <w:pPr>
-              <w:spacing w:after="0"/>
-            </w:pPr>
-          </w:p>
-        </w:tc>
-        <w:tc>
-          <w:tcPr>
-            <w:tcW w:w="1559" w:type="dxa"/>
+            <w:tcW w:w="2831" w:type="dxa"/>
+          </w:tcPr>
+          <w:p>
+            <w:pPr>
+              <w:spacing w:after="0"/>
+            </w:pPr>
+            <w:r>
+              <w:t>Gilmar Benedito de Souza Junior</w:t>
+            </w:r>
+            <w:r>
+              <w:t xml:space="preserve">, </w:t>
+            </w:r>
+            <w:proofErr w:type="spellStart"/>
+            <w:r>
+              <w:t>Kaique</w:t>
+            </w:r>
+            <w:proofErr w:type="spellEnd"/>
+            <w:r>
+              <w:t xml:space="preserve"> Lourenço de Andrade,</w:t>
+            </w:r>
+            <w:r>
+              <w:t xml:space="preserve"> </w:t>
+            </w:r>
+            <w:r>
+              <w:t xml:space="preserve">Luiz </w:t>
+            </w:r>
+            <w:proofErr w:type="spellStart"/>
+            <w:r>
+              <w:t>Antonio</w:t>
+            </w:r>
+            <w:proofErr w:type="spellEnd"/>
+            <w:r>
+              <w:t xml:space="preserve"> Lopes Junio</w:t>
+            </w:r>
+            <w:r>
+              <w:t>r,</w:t>
+            </w:r>
+          </w:p>
+          <w:p>
+            <w:pPr>
+              <w:spacing w:after="0"/>
+            </w:pPr>
+            <w:r>
+              <w:t>Thiago Augusto Pereira,</w:t>
+            </w:r>
+          </w:p>
+          <w:p>
+            <w:pPr>
+              <w:spacing w:after="0"/>
+            </w:pPr>
+            <w:r>
+              <w:t xml:space="preserve">Wallace </w:t>
+            </w:r>
+            <w:proofErr w:type="spellStart"/>
+            <w:r>
+              <w:t>Eliziario</w:t>
+            </w:r>
+            <w:proofErr w:type="spellEnd"/>
+            <w:r>
+              <w:t xml:space="preserve"> de Souza</w:t>
+            </w:r>
+          </w:p>
+        </w:tc>
+        <w:tc>
+          <w:tcPr>
+            <w:tcW w:w="1558" w:type="dxa"/>
           </w:tcPr>
           <w:p>
             <w:pPr>
@@ -4351,80 +4895,8 @@
         </w:tc>
         <w:tc>
           <w:tcPr>
-            <w:tcW w:w="4467" w:type="dxa"/>
-            <w:tcBorders>
-              <w:right w:val="single" w:sz="12" w:space="0" w:color="000000" w:themeColor="text1"/>
-            </w:tcBorders>
-          </w:tcPr>
-          <w:p>
-            <w:pPr>
-              <w:spacing w:after="0"/>
-            </w:pPr>
-          </w:p>
-        </w:tc>
-      </w:tr>
-      <w:tr>
-        <w:trPr>
-          <w:cantSplit/>
-        </w:trPr>
-        <w:tc>
-          <w:tcPr>
-            <w:tcW w:w="4390" w:type="dxa"/>
-            <w:tcBorders>
-              <w:left w:val="single" w:sz="12" w:space="0" w:color="000000" w:themeColor="text1"/>
-              <w:bottom w:val="single" w:sz="12" w:space="0" w:color="000000" w:themeColor="text1"/>
-            </w:tcBorders>
-          </w:tcPr>
-          <w:p>
-            <w:pPr>
-              <w:spacing w:after="0"/>
-            </w:pPr>
-          </w:p>
-        </w:tc>
-        <w:tc>
-          <w:tcPr>
-            <w:tcW w:w="2835" w:type="dxa"/>
-            <w:tcBorders>
-              <w:bottom w:val="single" w:sz="12" w:space="0" w:color="000000" w:themeColor="text1"/>
-            </w:tcBorders>
-          </w:tcPr>
-          <w:p>
-            <w:pPr>
-              <w:spacing w:after="0"/>
-            </w:pPr>
-          </w:p>
-        </w:tc>
-        <w:tc>
-          <w:tcPr>
-            <w:tcW w:w="1559" w:type="dxa"/>
-            <w:tcBorders>
-              <w:bottom w:val="single" w:sz="12" w:space="0" w:color="000000" w:themeColor="text1"/>
-            </w:tcBorders>
-          </w:tcPr>
-          <w:p>
-            <w:pPr>
-              <w:spacing w:after="0"/>
-            </w:pPr>
-          </w:p>
-        </w:tc>
-        <w:tc>
-          <w:tcPr>
-            <w:tcW w:w="1417" w:type="dxa"/>
-            <w:tcBorders>
-              <w:bottom w:val="single" w:sz="12" w:space="0" w:color="000000" w:themeColor="text1"/>
-            </w:tcBorders>
-          </w:tcPr>
-          <w:p>
-            <w:pPr>
-              <w:spacing w:after="0"/>
-            </w:pPr>
-          </w:p>
-        </w:tc>
-        <w:tc>
-          <w:tcPr>
-            <w:tcW w:w="4467" w:type="dxa"/>
-            <w:tcBorders>
-              <w:bottom w:val="single" w:sz="12" w:space="0" w:color="000000" w:themeColor="text1"/>
+            <w:tcW w:w="4459" w:type="dxa"/>
+            <w:tcBorders>
               <w:right w:val="single" w:sz="12" w:space="0" w:color="000000" w:themeColor="text1"/>
             </w:tcBorders>
           </w:tcPr>
@@ -4439,7 +4911,7 @@
     <w:p/>
     <w:tbl>
       <w:tblPr>
-        <w:tblStyle w:val="TableGrid"/>
+        <w:tblStyle w:val="Tabelacomgrade"/>
         <w:tblW w:w="0" w:type="auto"/>
         <w:tblCellMar>
           <w:top w:w="57" w:type="dxa"/>
@@ -4448,11 +4920,11 @@
         <w:tblLook w:val="04A0" w:firstRow="1" w:lastRow="0" w:firstColumn="1" w:lastColumn="0" w:noHBand="0" w:noVBand="1"/>
       </w:tblPr>
       <w:tblGrid>
-        <w:gridCol w:w="4383"/>
-        <w:gridCol w:w="2831"/>
-        <w:gridCol w:w="1558"/>
-        <w:gridCol w:w="1417"/>
-        <w:gridCol w:w="4459"/>
+        <w:gridCol w:w="2269"/>
+        <w:gridCol w:w="1687"/>
+        <w:gridCol w:w="1406"/>
+        <w:gridCol w:w="1379"/>
+        <w:gridCol w:w="2255"/>
       </w:tblGrid>
       <w:tr>
         <w:trPr>
@@ -4676,6 +5148,31 @@
             <w:pPr>
               <w:spacing w:after="0"/>
             </w:pPr>
+            <w:r>
+              <w:t>Larissa de Souza Aguiar</w:t>
+            </w:r>
+            <w:r>
+              <w:t xml:space="preserve">, </w:t>
+            </w:r>
+            <w:r>
+              <w:t>Thiago Augusto Pereira,</w:t>
+            </w:r>
+          </w:p>
+          <w:p>
+            <w:pPr>
+              <w:spacing w:after="0"/>
+            </w:pPr>
+            <w:r>
+              <w:t xml:space="preserve">Wallace </w:t>
+            </w:r>
+            <w:proofErr w:type="spellStart"/>
+            <w:r>
+              <w:t>Eliziario</w:t>
+            </w:r>
+            <w:proofErr w:type="spellEnd"/>
+            <w:r>
+              <w:t xml:space="preserve"> de Souza</w:t>
+            </w:r>
           </w:p>
         </w:tc>
         <w:tc>
@@ -4746,6 +5243,15 @@
             <w:pPr>
               <w:spacing w:after="0"/>
             </w:pPr>
+            <w:r>
+              <w:t>Gilmar Benedito de Souza Junior</w:t>
+            </w:r>
+            <w:r>
+              <w:t xml:space="preserve">, </w:t>
+            </w:r>
+            <w:r>
+              <w:t>Maíra Silva Edo</w:t>
+            </w:r>
           </w:p>
         </w:tc>
         <w:tc>
@@ -4819,6 +5325,34 @@
             <w:pPr>
               <w:spacing w:after="0"/>
             </w:pPr>
+            <w:proofErr w:type="spellStart"/>
+            <w:r>
+              <w:t>Kaique</w:t>
+            </w:r>
+            <w:proofErr w:type="spellEnd"/>
+            <w:r>
+              <w:t xml:space="preserve"> Lourenço de Andrade</w:t>
+            </w:r>
+            <w:r>
+              <w:t xml:space="preserve">, </w:t>
+            </w:r>
+            <w:r>
+              <w:t xml:space="preserve">Luiz </w:t>
+            </w:r>
+            <w:proofErr w:type="spellStart"/>
+            <w:r>
+              <w:t>Antonio</w:t>
+            </w:r>
+            <w:proofErr w:type="spellEnd"/>
+            <w:r>
+              <w:t xml:space="preserve"> Lopes Junior</w:t>
+            </w:r>
+            <w:r>
+              <w:t xml:space="preserve">, </w:t>
+            </w:r>
+            <w:r>
+              <w:t>Mariana dos Reis Silva</w:t>
+            </w:r>
           </w:p>
         </w:tc>
         <w:tc>
@@ -4877,7 +5411,14 @@
               <w:spacing w:after="0"/>
             </w:pPr>
             <w:r>
-              <w:t>Gravar vídeo</w:t>
+              <w:lastRenderedPageBreak/>
+              <w:t xml:space="preserve">Gravar </w:t>
+            </w:r>
+            <w:r>
+              <w:t xml:space="preserve">e editar </w:t>
+            </w:r>
+            <w:r>
+              <w:t>vídeo</w:t>
             </w:r>
             <w:r>
               <w:t xml:space="preserve"> de apresentação</w:t>
@@ -4892,6 +5433,86 @@
             <w:pPr>
               <w:spacing w:after="0"/>
             </w:pPr>
+            <w:r>
+              <w:t>Gilmar Benedito de Souza Junior,</w:t>
+            </w:r>
+          </w:p>
+          <w:p>
+            <w:pPr>
+              <w:spacing w:after="0"/>
+            </w:pPr>
+            <w:proofErr w:type="spellStart"/>
+            <w:r>
+              <w:t>Kaique</w:t>
+            </w:r>
+            <w:proofErr w:type="spellEnd"/>
+            <w:r>
+              <w:t xml:space="preserve"> Lourenço de Andrade,</w:t>
+            </w:r>
+          </w:p>
+          <w:p>
+            <w:pPr>
+              <w:spacing w:after="0"/>
+            </w:pPr>
+            <w:r>
+              <w:t>Larissa de Souza Aguiar,</w:t>
+            </w:r>
+          </w:p>
+          <w:p>
+            <w:pPr>
+              <w:spacing w:after="0"/>
+            </w:pPr>
+            <w:r>
+              <w:t xml:space="preserve">Luiz </w:t>
+            </w:r>
+            <w:proofErr w:type="spellStart"/>
+            <w:r>
+              <w:t>Antonio</w:t>
+            </w:r>
+            <w:proofErr w:type="spellEnd"/>
+            <w:r>
+              <w:t xml:space="preserve"> Lopes Junior,</w:t>
+            </w:r>
+          </w:p>
+          <w:p>
+            <w:pPr>
+              <w:spacing w:after="0"/>
+            </w:pPr>
+            <w:r>
+              <w:t>Maíra Silva Edo,</w:t>
+            </w:r>
+          </w:p>
+          <w:p>
+            <w:pPr>
+              <w:spacing w:after="0"/>
+            </w:pPr>
+            <w:r>
+              <w:t>Mariana dos Reis Silva,</w:t>
+            </w:r>
+          </w:p>
+          <w:p>
+            <w:pPr>
+              <w:spacing w:after="0"/>
+            </w:pPr>
+            <w:r>
+              <w:t>Thiago Augusto Pereira,</w:t>
+            </w:r>
+          </w:p>
+          <w:p>
+            <w:pPr>
+              <w:spacing w:after="0"/>
+            </w:pPr>
+            <w:r>
+              <w:t xml:space="preserve">Wallace </w:t>
+            </w:r>
+            <w:proofErr w:type="spellStart"/>
+            <w:r>
+              <w:t>Eliziario</w:t>
+            </w:r>
+            <w:proofErr w:type="spellEnd"/>
+            <w:r>
+              <w:t xml:space="preserve"> de Souza</w:t>
+            </w:r>
           </w:p>
         </w:tc>
         <w:tc>
@@ -4946,78 +5567,6 @@
             <w:r>
               <w:t>ecnologias utilizadas</w:t>
             </w:r>
-          </w:p>
-        </w:tc>
-      </w:tr>
-      <w:tr>
-        <w:trPr>
-          <w:cantSplit/>
-        </w:trPr>
-        <w:tc>
-          <w:tcPr>
-            <w:tcW w:w="4383" w:type="dxa"/>
-            <w:tcBorders>
-              <w:left w:val="single" w:sz="12" w:space="0" w:color="000000" w:themeColor="text1"/>
-              <w:bottom w:val="single" w:sz="12" w:space="0" w:color="000000" w:themeColor="text1"/>
-            </w:tcBorders>
-          </w:tcPr>
-          <w:p>
-            <w:pPr>
-              <w:spacing w:after="0"/>
-            </w:pPr>
-          </w:p>
-        </w:tc>
-        <w:tc>
-          <w:tcPr>
-            <w:tcW w:w="2831" w:type="dxa"/>
-            <w:tcBorders>
-              <w:bottom w:val="single" w:sz="12" w:space="0" w:color="000000" w:themeColor="text1"/>
-            </w:tcBorders>
-          </w:tcPr>
-          <w:p>
-            <w:pPr>
-              <w:spacing w:after="0"/>
-            </w:pPr>
-          </w:p>
-        </w:tc>
-        <w:tc>
-          <w:tcPr>
-            <w:tcW w:w="1558" w:type="dxa"/>
-            <w:tcBorders>
-              <w:bottom w:val="single" w:sz="12" w:space="0" w:color="000000" w:themeColor="text1"/>
-            </w:tcBorders>
-          </w:tcPr>
-          <w:p>
-            <w:pPr>
-              <w:spacing w:after="0"/>
-            </w:pPr>
-          </w:p>
-        </w:tc>
-        <w:tc>
-          <w:tcPr>
-            <w:tcW w:w="1417" w:type="dxa"/>
-            <w:tcBorders>
-              <w:bottom w:val="single" w:sz="12" w:space="0" w:color="000000" w:themeColor="text1"/>
-            </w:tcBorders>
-          </w:tcPr>
-          <w:p>
-            <w:pPr>
-              <w:spacing w:after="0"/>
-            </w:pPr>
-          </w:p>
-        </w:tc>
-        <w:tc>
-          <w:tcPr>
-            <w:tcW w:w="4459" w:type="dxa"/>
-            <w:tcBorders>
-              <w:bottom w:val="single" w:sz="12" w:space="0" w:color="000000" w:themeColor="text1"/>
-              <w:right w:val="single" w:sz="12" w:space="0" w:color="000000" w:themeColor="text1"/>
-            </w:tcBorders>
-          </w:tcPr>
-          <w:p>
-            <w:pPr>
-              <w:spacing w:after="0"/>
-            </w:pPr>
           </w:p>
         </w:tc>
       </w:tr>
@@ -5025,7 +5574,7 @@
     <w:p/>
     <w:tbl>
       <w:tblPr>
-        <w:tblStyle w:val="TableGrid"/>
+        <w:tblStyle w:val="Tabelacomgrade"/>
         <w:tblW w:w="0" w:type="auto"/>
         <w:tblCellMar>
           <w:top w:w="57" w:type="dxa"/>
@@ -5034,11 +5583,11 @@
         <w:tblLook w:val="04A0" w:firstRow="1" w:lastRow="0" w:firstColumn="1" w:lastColumn="0" w:noHBand="0" w:noVBand="1"/>
       </w:tblPr>
       <w:tblGrid>
-        <w:gridCol w:w="4382"/>
-        <w:gridCol w:w="2832"/>
-        <w:gridCol w:w="1557"/>
-        <w:gridCol w:w="1417"/>
-        <w:gridCol w:w="4460"/>
+        <w:gridCol w:w="2225"/>
+        <w:gridCol w:w="1709"/>
+        <w:gridCol w:w="1409"/>
+        <w:gridCol w:w="1380"/>
+        <w:gridCol w:w="2273"/>
       </w:tblGrid>
       <w:tr>
         <w:trPr>
@@ -5247,6 +5796,9 @@
             <w:pPr>
               <w:spacing w:after="0"/>
             </w:pPr>
+            <w:r>
+              <w:t>Maíra Silva Edo</w:t>
+            </w:r>
           </w:p>
         </w:tc>
         <w:tc>
@@ -5311,6 +5863,7 @@
               <w:spacing w:after="0"/>
             </w:pPr>
             <w:r>
+              <w:lastRenderedPageBreak/>
               <w:t>Elaborar Relatório Final</w:t>
             </w:r>
           </w:p>
@@ -5323,6 +5876,40 @@
             <w:pPr>
               <w:spacing w:after="0"/>
             </w:pPr>
+            <w:proofErr w:type="spellStart"/>
+            <w:r>
+              <w:t>Kaique</w:t>
+            </w:r>
+            <w:proofErr w:type="spellEnd"/>
+            <w:r>
+              <w:t xml:space="preserve"> Lourenço de Andrade</w:t>
+            </w:r>
+            <w:r>
+              <w:t xml:space="preserve">, </w:t>
+            </w:r>
+            <w:r>
+              <w:t>Larissa de Souza Aguiar</w:t>
+            </w:r>
+            <w:r>
+              <w:t xml:space="preserve">, </w:t>
+            </w:r>
+            <w:r>
+              <w:t xml:space="preserve">Luiz </w:t>
+            </w:r>
+            <w:proofErr w:type="spellStart"/>
+            <w:r>
+              <w:t>Antonio</w:t>
+            </w:r>
+            <w:proofErr w:type="spellEnd"/>
+            <w:r>
+              <w:t xml:space="preserve"> Lopes Junior</w:t>
+            </w:r>
+            <w:r>
+              <w:t xml:space="preserve">, </w:t>
+            </w:r>
+            <w:r>
+              <w:t>Mariana dos Reis Silva</w:t>
+            </w:r>
           </w:p>
         </w:tc>
         <w:tc>
@@ -5381,7 +5968,6 @@
               <w:spacing w:after="0"/>
             </w:pPr>
             <w:r>
-              <w:lastRenderedPageBreak/>
               <w:t>Revisa</w:t>
             </w:r>
             <w:r>
@@ -5397,6 +5983,29 @@
             <w:pPr>
               <w:spacing w:after="0"/>
             </w:pPr>
+            <w:r>
+              <w:t>Gilmar Benedito de Souza Junior</w:t>
+            </w:r>
+            <w:r>
+              <w:t xml:space="preserve">, </w:t>
+            </w:r>
+            <w:r>
+              <w:t>Thiago Augusto Pereira</w:t>
+            </w:r>
+            <w:r>
+              <w:t xml:space="preserve">, </w:t>
+            </w:r>
+            <w:r>
+              <w:t xml:space="preserve">Wallace </w:t>
+            </w:r>
+            <w:proofErr w:type="spellStart"/>
+            <w:r>
+              <w:t>Eliziario</w:t>
+            </w:r>
+            <w:proofErr w:type="spellEnd"/>
+            <w:r>
+              <w:t xml:space="preserve"> de Souza</w:t>
+            </w:r>
           </w:p>
         </w:tc>
         <w:tc>
@@ -5485,6 +6094,86 @@
             <w:pPr>
               <w:spacing w:after="0"/>
             </w:pPr>
+            <w:r>
+              <w:t>Gilmar Benedito de Souza Junior,</w:t>
+            </w:r>
+          </w:p>
+          <w:p>
+            <w:pPr>
+              <w:spacing w:after="0"/>
+            </w:pPr>
+            <w:proofErr w:type="spellStart"/>
+            <w:r>
+              <w:t>Kaique</w:t>
+            </w:r>
+            <w:proofErr w:type="spellEnd"/>
+            <w:r>
+              <w:t xml:space="preserve"> Lourenço de Andrade,</w:t>
+            </w:r>
+          </w:p>
+          <w:p>
+            <w:pPr>
+              <w:spacing w:after="0"/>
+            </w:pPr>
+            <w:r>
+              <w:t>Larissa de Souza Aguiar,</w:t>
+            </w:r>
+          </w:p>
+          <w:p>
+            <w:pPr>
+              <w:spacing w:after="0"/>
+            </w:pPr>
+            <w:r>
+              <w:t xml:space="preserve">Luiz </w:t>
+            </w:r>
+            <w:proofErr w:type="spellStart"/>
+            <w:r>
+              <w:t>Antonio</w:t>
+            </w:r>
+            <w:proofErr w:type="spellEnd"/>
+            <w:r>
+              <w:t xml:space="preserve"> Lopes Junior,</w:t>
+            </w:r>
+          </w:p>
+          <w:p>
+            <w:pPr>
+              <w:spacing w:after="0"/>
+            </w:pPr>
+            <w:r>
+              <w:t>Maíra Silva Edo,</w:t>
+            </w:r>
+          </w:p>
+          <w:p>
+            <w:pPr>
+              <w:spacing w:after="0"/>
+            </w:pPr>
+            <w:r>
+              <w:t>Mariana dos Reis Silva,</w:t>
+            </w:r>
+          </w:p>
+          <w:p>
+            <w:pPr>
+              <w:spacing w:after="0"/>
+            </w:pPr>
+            <w:r>
+              <w:t>Thiago Augusto Pereira,</w:t>
+            </w:r>
+          </w:p>
+          <w:p>
+            <w:pPr>
+              <w:spacing w:after="0"/>
+            </w:pPr>
+            <w:r>
+              <w:t xml:space="preserve">Wallace </w:t>
+            </w:r>
+            <w:proofErr w:type="spellStart"/>
+            <w:r>
+              <w:t>Eliziario</w:t>
+            </w:r>
+            <w:proofErr w:type="spellEnd"/>
+            <w:r>
+              <w:t xml:space="preserve"> de Souza</w:t>
+            </w:r>
           </w:p>
         </w:tc>
         <w:tc>
@@ -5527,67 +6216,6 @@
             <w:r>
               <w:t>Projeto concluído e entregue</w:t>
             </w:r>
-          </w:p>
-        </w:tc>
-      </w:tr>
-      <w:tr>
-        <w:trPr>
-          <w:cantSplit/>
-        </w:trPr>
-        <w:tc>
-          <w:tcPr>
-            <w:tcW w:w="4382" w:type="dxa"/>
-            <w:tcBorders>
-              <w:left w:val="single" w:sz="12" w:space="0" w:color="000000" w:themeColor="text1"/>
-            </w:tcBorders>
-          </w:tcPr>
-          <w:p>
-            <w:pPr>
-              <w:spacing w:after="0"/>
-            </w:pPr>
-          </w:p>
-        </w:tc>
-        <w:tc>
-          <w:tcPr>
-            <w:tcW w:w="2832" w:type="dxa"/>
-          </w:tcPr>
-          <w:p>
-            <w:pPr>
-              <w:spacing w:after="0"/>
-            </w:pPr>
-          </w:p>
-        </w:tc>
-        <w:tc>
-          <w:tcPr>
-            <w:tcW w:w="1557" w:type="dxa"/>
-          </w:tcPr>
-          <w:p>
-            <w:pPr>
-              <w:spacing w:after="0"/>
-            </w:pPr>
-          </w:p>
-        </w:tc>
-        <w:tc>
-          <w:tcPr>
-            <w:tcW w:w="1417" w:type="dxa"/>
-          </w:tcPr>
-          <w:p>
-            <w:pPr>
-              <w:spacing w:after="0"/>
-            </w:pPr>
-          </w:p>
-        </w:tc>
-        <w:tc>
-          <w:tcPr>
-            <w:tcW w:w="4460" w:type="dxa"/>
-            <w:tcBorders>
-              <w:right w:val="single" w:sz="12" w:space="0" w:color="000000" w:themeColor="text1"/>
-            </w:tcBorders>
-          </w:tcPr>
-          <w:p>
-            <w:pPr>
-              <w:spacing w:after="0"/>
-            </w:pPr>
           </w:p>
         </w:tc>
       </w:tr>
@@ -5603,10 +6231,11 @@
     </w:p>
     <w:sectPr>
       <w:footerReference w:type="default" r:id="rId14"/>
-      <w:pgSz w:w="16838" w:h="11906"/>
-      <w:pgMar w:top="1440" w:right="1080" w:bottom="1440" w:left="1080" w:header="708" w:footer="708" w:gutter="0"/>
+      <w:pgSz w:w="11906" w:h="16838" w:orient="landscape"/>
+      <w:pgMar w:top="1080" w:right="1440" w:bottom="1080" w:left="1440" w:header="708" w:footer="708" w:gutter="0"/>
       <w:pgNumType w:start="1"/>
       <w:cols w:space="720"/>
+      <w:docGrid w:linePitch="299"/>
     </w:sectPr>
   </w:body>
 </w:document>
@@ -5657,7 +6286,7 @@
         </w:tcPr>
         <w:p>
           <w:pPr>
-            <w:pStyle w:val="Header"/>
+            <w:pStyle w:val="Cabealho"/>
             <w:ind w:left="-115"/>
           </w:pPr>
         </w:p>
@@ -5668,7 +6297,7 @@
         </w:tcPr>
         <w:p>
           <w:pPr>
-            <w:pStyle w:val="Header"/>
+            <w:pStyle w:val="Cabealho"/>
             <w:jc w:val="center"/>
           </w:pPr>
         </w:p>
@@ -5679,7 +6308,7 @@
         </w:tcPr>
         <w:p>
           <w:pPr>
-            <w:pStyle w:val="Header"/>
+            <w:pStyle w:val="Cabealho"/>
             <w:ind w:right="-115"/>
             <w:jc w:val="right"/>
           </w:pPr>
@@ -5689,7 +6318,7 @@
   </w:tbl>
   <w:p>
     <w:pPr>
-      <w:pStyle w:val="Footer"/>
+      <w:pStyle w:val="Rodap"/>
     </w:pPr>
   </w:p>
 </w:ftr>
@@ -5715,7 +6344,7 @@
         </w:tcPr>
         <w:p>
           <w:pPr>
-            <w:pStyle w:val="Header"/>
+            <w:pStyle w:val="Cabealho"/>
             <w:ind w:left="-115"/>
           </w:pPr>
         </w:p>
@@ -5726,7 +6355,7 @@
         </w:tcPr>
         <w:p>
           <w:pPr>
-            <w:pStyle w:val="Header"/>
+            <w:pStyle w:val="Cabealho"/>
             <w:jc w:val="center"/>
           </w:pPr>
         </w:p>
@@ -5737,7 +6366,7 @@
         </w:tcPr>
         <w:p>
           <w:pPr>
-            <w:pStyle w:val="Header"/>
+            <w:pStyle w:val="Cabealho"/>
             <w:ind w:right="-115"/>
             <w:jc w:val="right"/>
           </w:pPr>
@@ -5747,7 +6376,7 @@
   </w:tbl>
   <w:p>
     <w:pPr>
-      <w:pStyle w:val="Footer"/>
+      <w:pStyle w:val="Rodap"/>
     </w:pPr>
   </w:p>
 </w:ftr>
@@ -5881,7 +6510,7 @@
   </w:p>
   <w:p>
     <w:pPr>
-      <w:pStyle w:val="Header"/>
+      <w:pStyle w:val="Cabealho"/>
       <w:rPr>
         <w:rFonts w:ascii="Tahoma" w:hAnsi="Tahoma" w:cs="Tahoma"/>
         <w:color w:val="808080"/>
@@ -5899,7 +6528,7 @@
   </w:p>
   <w:p>
     <w:pPr>
-      <w:pStyle w:val="Header"/>
+      <w:pStyle w:val="Cabealho"/>
     </w:pPr>
   </w:p>
 </w:hdr>
@@ -6311,7 +6940,7 @@
       <w:rFonts w:ascii="Trebuchet MS" w:hAnsi="Trebuchet MS"/>
     </w:rPr>
   </w:style>
-  <w:style w:type="paragraph" w:styleId="Heading1">
+  <w:style w:type="paragraph" w:styleId="Ttulo1">
     <w:name w:val="heading 1"/>
     <w:basedOn w:val="Normal"/>
     <w:next w:val="Normal"/>
@@ -6329,7 +6958,7 @@
       <w:szCs w:val="48"/>
     </w:rPr>
   </w:style>
-  <w:style w:type="paragraph" w:styleId="Heading2">
+  <w:style w:type="paragraph" w:styleId="Ttulo2">
     <w:name w:val="heading 2"/>
     <w:basedOn w:val="Normal"/>
     <w:next w:val="Normal"/>
@@ -6349,7 +6978,7 @@
       <w:szCs w:val="36"/>
     </w:rPr>
   </w:style>
-  <w:style w:type="paragraph" w:styleId="Heading3">
+  <w:style w:type="paragraph" w:styleId="Ttulo3">
     <w:name w:val="heading 3"/>
     <w:basedOn w:val="Normal"/>
     <w:next w:val="Normal"/>
@@ -6369,7 +6998,7 @@
       <w:szCs w:val="28"/>
     </w:rPr>
   </w:style>
-  <w:style w:type="paragraph" w:styleId="Heading4">
+  <w:style w:type="paragraph" w:styleId="Ttulo4">
     <w:name w:val="heading 4"/>
     <w:basedOn w:val="Normal"/>
     <w:next w:val="Normal"/>
@@ -6389,7 +7018,7 @@
       <w:szCs w:val="24"/>
     </w:rPr>
   </w:style>
-  <w:style w:type="paragraph" w:styleId="Heading5">
+  <w:style w:type="paragraph" w:styleId="Ttulo5">
     <w:name w:val="heading 5"/>
     <w:basedOn w:val="Normal"/>
     <w:next w:val="Normal"/>
@@ -6407,7 +7036,7 @@
       <w:b/>
     </w:rPr>
   </w:style>
-  <w:style w:type="paragraph" w:styleId="Heading6">
+  <w:style w:type="paragraph" w:styleId="Ttulo6">
     <w:name w:val="heading 6"/>
     <w:basedOn w:val="Normal"/>
     <w:next w:val="Normal"/>
@@ -6427,13 +7056,13 @@
       <w:szCs w:val="20"/>
     </w:rPr>
   </w:style>
-  <w:style w:type="character" w:default="1" w:styleId="DefaultParagraphFont">
+  <w:style w:type="character" w:default="1" w:styleId="Fontepargpadro">
     <w:name w:val="Default Paragraph Font"/>
     <w:uiPriority w:val="1"/>
     <w:semiHidden/>
     <w:unhideWhenUsed/>
   </w:style>
-  <w:style w:type="table" w:default="1" w:styleId="TableNormal">
+  <w:style w:type="table" w:default="1" w:styleId="Tabelanormal">
     <w:name w:val="Normal Table"/>
     <w:uiPriority w:val="99"/>
     <w:semiHidden/>
@@ -6448,13 +7077,13 @@
       </w:tblCellMar>
     </w:tblPr>
   </w:style>
-  <w:style w:type="numbering" w:default="1" w:styleId="NoList">
+  <w:style w:type="numbering" w:default="1" w:styleId="Semlista">
     <w:name w:val="No List"/>
     <w:uiPriority w:val="99"/>
     <w:semiHidden/>
     <w:unhideWhenUsed/>
   </w:style>
-  <w:style w:type="paragraph" w:styleId="Title">
+  <w:style w:type="paragraph" w:styleId="Ttulo">
     <w:name w:val="Title"/>
     <w:basedOn w:val="Normal"/>
     <w:next w:val="Normal"/>
@@ -6490,10 +7119,10 @@
       </w:tblCellMar>
     </w:tblPr>
   </w:style>
-  <w:style w:type="paragraph" w:styleId="Header">
+  <w:style w:type="paragraph" w:styleId="Cabealho">
     <w:name w:val="header"/>
     <w:basedOn w:val="Normal0"/>
-    <w:link w:val="HeaderChar"/>
+    <w:link w:val="CabealhoChar"/>
     <w:unhideWhenUsed/>
     <w:rsid w:val="008F181D"/>
     <w:pPr>
@@ -6504,16 +7133,16 @@
       <w:spacing w:after="0" w:line="240" w:lineRule="auto"/>
     </w:pPr>
   </w:style>
-  <w:style w:type="character" w:customStyle="1" w:styleId="HeaderChar">
-    <w:name w:val="Header Char"/>
-    <w:basedOn w:val="DefaultParagraphFont"/>
-    <w:link w:val="Header"/>
+  <w:style w:type="character" w:customStyle="1" w:styleId="CabealhoChar">
+    <w:name w:val="Cabeçalho Char"/>
+    <w:basedOn w:val="Fontepargpadro"/>
+    <w:link w:val="Cabealho"/>
     <w:rsid w:val="008F181D"/>
   </w:style>
-  <w:style w:type="paragraph" w:styleId="Footer">
+  <w:style w:type="paragraph" w:styleId="Rodap">
     <w:name w:val="footer"/>
     <w:basedOn w:val="Normal0"/>
-    <w:link w:val="FooterChar"/>
+    <w:link w:val="RodapChar"/>
     <w:uiPriority w:val="99"/>
     <w:unhideWhenUsed/>
     <w:rsid w:val="008F181D"/>
@@ -6525,14 +7154,14 @@
       <w:spacing w:after="0" w:line="240" w:lineRule="auto"/>
     </w:pPr>
   </w:style>
-  <w:style w:type="character" w:customStyle="1" w:styleId="FooterChar">
-    <w:name w:val="Footer Char"/>
-    <w:basedOn w:val="DefaultParagraphFont"/>
-    <w:link w:val="Footer"/>
+  <w:style w:type="character" w:customStyle="1" w:styleId="RodapChar">
+    <w:name w:val="Rodapé Char"/>
+    <w:basedOn w:val="Fontepargpadro"/>
+    <w:link w:val="Rodap"/>
     <w:uiPriority w:val="99"/>
     <w:rsid w:val="008F181D"/>
   </w:style>
-  <w:style w:type="paragraph" w:styleId="Subtitle">
+  <w:style w:type="paragraph" w:styleId="Subttulo">
     <w:name w:val="Subtitle"/>
     <w:basedOn w:val="Normal0"/>
     <w:next w:val="Normal0"/>
@@ -6552,7 +7181,7 @@
     </w:rPr>
   </w:style>
   <w:style w:type="table" w:customStyle="1" w:styleId="a">
-    <w:basedOn w:val="TableNormal"/>
+    <w:basedOn w:val="Tabelanormal"/>
     <w:tblPr>
       <w:tblStyleRowBandSize w:val="1"/>
       <w:tblStyleColBandSize w:val="1"/>
@@ -6563,7 +7192,7 @@
     </w:tblPr>
   </w:style>
   <w:style w:type="table" w:customStyle="1" w:styleId="a0">
-    <w:basedOn w:val="TableNormal"/>
+    <w:basedOn w:val="Tabelanormal"/>
     <w:tblPr>
       <w:tblStyleRowBandSize w:val="1"/>
       <w:tblStyleColBandSize w:val="1"/>
@@ -6573,9 +7202,9 @@
       </w:tblCellMar>
     </w:tblPr>
   </w:style>
-  <w:style w:type="table" w:styleId="TableGrid">
+  <w:style w:type="table" w:styleId="Tabelacomgrade">
     <w:name w:val="Table Grid"/>
-    <w:basedOn w:val="TableNormal"/>
+    <w:basedOn w:val="Tabelanormal"/>
     <w:uiPriority w:val="59"/>
     <w:rsid w:val="00FB4123"/>
     <w:pPr>
@@ -6592,10 +7221,10 @@
       </w:tblBorders>
     </w:tblPr>
   </w:style>
-  <w:style w:type="paragraph" w:styleId="CommentText">
+  <w:style w:type="paragraph" w:styleId="Textodecomentrio">
     <w:name w:val="annotation text"/>
     <w:basedOn w:val="Normal"/>
-    <w:link w:val="CommentTextChar"/>
+    <w:link w:val="TextodecomentrioChar"/>
     <w:uiPriority w:val="99"/>
     <w:semiHidden/>
     <w:unhideWhenUsed/>
@@ -6607,10 +7236,10 @@
       <w:szCs w:val="20"/>
     </w:rPr>
   </w:style>
-  <w:style w:type="character" w:customStyle="1" w:styleId="CommentTextChar">
-    <w:name w:val="Comment Text Char"/>
-    <w:basedOn w:val="DefaultParagraphFont"/>
-    <w:link w:val="CommentText"/>
+  <w:style w:type="character" w:customStyle="1" w:styleId="TextodecomentrioChar">
+    <w:name w:val="Texto de comentário Char"/>
+    <w:basedOn w:val="Fontepargpadro"/>
+    <w:link w:val="Textodecomentrio"/>
     <w:uiPriority w:val="99"/>
     <w:semiHidden/>
     <w:rPr>
@@ -6618,9 +7247,9 @@
       <w:szCs w:val="20"/>
     </w:rPr>
   </w:style>
-  <w:style w:type="character" w:styleId="CommentReference">
+  <w:style w:type="character" w:styleId="Refdecomentrio">
     <w:name w:val="annotation reference"/>
-    <w:basedOn w:val="DefaultParagraphFont"/>
+    <w:basedOn w:val="Fontepargpadro"/>
     <w:uiPriority w:val="99"/>
     <w:semiHidden/>
     <w:unhideWhenUsed/>
@@ -6629,9 +7258,9 @@
       <w:szCs w:val="16"/>
     </w:rPr>
   </w:style>
-  <w:style w:type="character" w:styleId="PlaceholderText">
+  <w:style w:type="character" w:styleId="TextodoEspaoReservado">
     <w:name w:val="Placeholder Text"/>
-    <w:basedOn w:val="DefaultParagraphFont"/>
+    <w:basedOn w:val="Fontepargpadro"/>
     <w:uiPriority w:val="99"/>
     <w:rsid w:val="00BB04BA"/>
     <w:rPr>
@@ -6937,15 +7566,6 @@
 </file>
 
 <file path=customXml/item1.xml><?xml version="1.0" encoding="utf-8"?>
-<?mso-contentType ?>
-<FormTemplates xmlns="http://schemas.microsoft.com/sharepoint/v3/contenttype/forms">
-  <Display>DocumentLibraryForm</Display>
-  <Edit>DocumentLibraryForm</Edit>
-  <New>DocumentLibraryForm</New>
-</FormTemplates>
-</file>
-
-<file path=customXml/item2.xml><?xml version="1.0" encoding="utf-8"?>
 <ct:contentTypeSchema xmlns:ct="http://schemas.microsoft.com/office/2006/metadata/contentType" xmlns:ma="http://schemas.microsoft.com/office/2006/metadata/properties/metaAttributes" ct:_="" ma:_="" ma:contentTypeName="Documento" ma:contentTypeID="0x0101006CFD0211DE75424E90D6B9FC9752CE9C" ma:contentTypeVersion="16" ma:contentTypeDescription="Crie um novo documento." ma:contentTypeScope="" ma:versionID="eb0d476544d351e325591e9e7c010312">
   <xsd:schema xmlns:xsd="http://www.w3.org/2001/XMLSchema" xmlns:xs="http://www.w3.org/2001/XMLSchema" xmlns:p="http://schemas.microsoft.com/office/2006/metadata/properties" xmlns:ns2="7432f127-f33c-42e2-a68a-9048c01697a7" xmlns:ns3="b69dc6fa-2096-41e7-baef-054d5bf17313" targetNamespace="http://schemas.microsoft.com/office/2006/metadata/properties" ma:root="true" ma:fieldsID="090e7113f6b1f759a4c1efa3add07bc2" ns2:_="" ns3:_="">
     <xsd:import namespace="7432f127-f33c-42e2-a68a-9048c01697a7"/>
@@ -7205,7 +7825,39 @@
 </ct:contentTypeSchema>
 </file>
 
+<file path=customXml/item2.xml><?xml version="1.0" encoding="utf-8"?>
+<?mso-contentType ?>
+<FormTemplates xmlns="http://schemas.microsoft.com/sharepoint/v3/contenttype/forms">
+  <Display>DocumentLibraryForm</Display>
+  <Edit>DocumentLibraryForm</Edit>
+  <New>DocumentLibraryForm</New>
+</FormTemplates>
+</file>
+
 <file path=customXml/item3.xml><?xml version="1.0" encoding="utf-8"?>
+<p:properties xmlns:p="http://schemas.microsoft.com/office/2006/metadata/properties" xmlns:xsi="http://www.w3.org/2001/XMLSchema-instance" xmlns:pc="http://schemas.microsoft.com/office/infopath/2007/PartnerControls">
+  <documentManagement>
+    <teste xmlns="7432f127-f33c-42e2-a68a-9048c01697a7" xsi:nil="true"/>
+    <_dlc_DocId xmlns="b69dc6fa-2096-41e7-baef-054d5bf17313">E726VFYCRFHJ-229561519-15240</_dlc_DocId>
+    <_dlc_DocIdUrl xmlns="b69dc6fa-2096-41e7-baef-054d5bf17313">
+      <Url>https://univespprojetomicrosoft.sharepoint.com/sites/DisciplinasGraduacao/_layouts/15/DocIdRedir.aspx?ID=E726VFYCRFHJ-229561519-15240</Url>
+      <Description>E726VFYCRFHJ-229561519-15240</Description>
+    </_dlc_DocIdUrl>
+  </documentManagement>
+</p:properties>
+</file>
+
+<file path=customXml/item4.xml><?xml version="1.0" encoding="utf-8"?>
+<go:gDocsCustomXmlDataStorage xmlns:go="http://customooxmlschemas.google.com/" xmlns:r="http://schemas.openxmlformats.org/officeDocument/2006/relationships">
+  <go:docsCustomData xmlns:go="http://customooxmlschemas.google.com/" roundtripDataSignature="AMtx7mhTsKLM0Xu2rrFPSK8Wu5hhcrD6fw==">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</go:docsCustomData>
+</go:gDocsCustomXmlDataStorage>
+</file>
+
+<file path=customXml/item5.xml><?xml version="1.0" encoding="utf-8"?>
+<b:Sources xmlns:b="http://schemas.openxmlformats.org/officeDocument/2006/bibliography" xmlns="http://schemas.openxmlformats.org/officeDocument/2006/bibliography" SelectedStyle="\APASixthEditionOfficeOnline.xsl" StyleName="APA" Version="6"/>
+</file>
+
+<file path=customXml/item6.xml><?xml version="1.0" encoding="utf-8"?>
 <?mso-contentType ?>
 <spe:Receivers xmlns:spe="http://schemas.microsoft.com/sharepoint/events">
   <Receiver>
@@ -7255,38 +7907,7 @@
 </spe:Receivers>
 </file>
 
-<file path=customXml/item4.xml><?xml version="1.0" encoding="utf-8"?>
-<b:Sources xmlns:b="http://schemas.openxmlformats.org/officeDocument/2006/bibliography" xmlns="http://schemas.openxmlformats.org/officeDocument/2006/bibliography" SelectedStyle="\APASixthEditionOfficeOnline.xsl" StyleName="APA" Version="6"/>
-</file>
-
-<file path=customXml/item5.xml><?xml version="1.0" encoding="utf-8"?>
-<go:gDocsCustomXmlDataStorage xmlns:go="http://customooxmlschemas.google.com/" xmlns:r="http://schemas.openxmlformats.org/officeDocument/2006/relationships">
-  <go:docsCustomData xmlns:go="http://customooxmlschemas.google.com/" roundtripDataSignature="AMtx7mhTsKLM0Xu2rrFPSK8Wu5hhcrD6fw==">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</go:docsCustomData>
-</go:gDocsCustomXmlDataStorage>
-</file>
-
-<file path=customXml/item6.xml><?xml version="1.0" encoding="utf-8"?>
-<p:properties xmlns:p="http://schemas.microsoft.com/office/2006/metadata/properties" xmlns:xsi="http://www.w3.org/2001/XMLSchema-instance" xmlns:pc="http://schemas.microsoft.com/office/infopath/2007/PartnerControls">
-  <documentManagement>
-    <teste xmlns="7432f127-f33c-42e2-a68a-9048c01697a7" xsi:nil="true"/>
-    <_dlc_DocId xmlns="b69dc6fa-2096-41e7-baef-054d5bf17313">E726VFYCRFHJ-229561519-15240</_dlc_DocId>
-    <_dlc_DocIdUrl xmlns="b69dc6fa-2096-41e7-baef-054d5bf17313">
-      <Url>https://univespprojetomicrosoft.sharepoint.com/sites/DisciplinasGraduacao/_layouts/15/DocIdRedir.aspx?ID=E726VFYCRFHJ-229561519-15240</Url>
-      <Description>E726VFYCRFHJ-229561519-15240</Description>
-    </_dlc_DocIdUrl>
-  </documentManagement>
-</p:properties>
-</file>
-
 <file path=customXml/itemProps1.xml><?xml version="1.0" encoding="utf-8"?>
-<ds:datastoreItem xmlns:ds="http://schemas.openxmlformats.org/officeDocument/2006/customXml" ds:itemID="{413DB90E-9A64-442A-AD38-C95AB3E4EF9F}">
-  <ds:schemaRefs>
-    <ds:schemaRef ds:uri="http://schemas.microsoft.com/sharepoint/v3/contenttype/forms"/>
-  </ds:schemaRefs>
-</ds:datastoreItem>
-</file>
-
-<file path=customXml/itemProps2.xml><?xml version="1.0" encoding="utf-8"?>
 <ds:datastoreItem xmlns:ds="http://schemas.openxmlformats.org/officeDocument/2006/customXml" ds:itemID="{27178C62-D9D3-4513-B322-2098833940E5}">
   <ds:schemaRefs>
     <ds:schemaRef ds:uri="http://schemas.microsoft.com/office/2006/metadata/contentType"/>
@@ -7305,23 +7926,26 @@
 </ds:datastoreItem>
 </file>
 
+<file path=customXml/itemProps2.xml><?xml version="1.0" encoding="utf-8"?>
+<ds:datastoreItem xmlns:ds="http://schemas.openxmlformats.org/officeDocument/2006/customXml" ds:itemID="{413DB90E-9A64-442A-AD38-C95AB3E4EF9F}">
+  <ds:schemaRefs>
+    <ds:schemaRef ds:uri="http://schemas.microsoft.com/sharepoint/v3/contenttype/forms"/>
+  </ds:schemaRefs>
+</ds:datastoreItem>
+</file>
+
 <file path=customXml/itemProps3.xml><?xml version="1.0" encoding="utf-8"?>
-<ds:datastoreItem xmlns:ds="http://schemas.openxmlformats.org/officeDocument/2006/customXml" ds:itemID="{001C8AF1-0A5A-4192-973C-413DD19C3B92}">
+<ds:datastoreItem xmlns:ds="http://schemas.openxmlformats.org/officeDocument/2006/customXml" ds:itemID="{AB6D30A6-B7AA-49D0-8DAC-77DF30570A2D}">
   <ds:schemaRefs>
-    <ds:schemaRef ds:uri="http://schemas.microsoft.com/sharepoint/events"/>
+    <ds:schemaRef ds:uri="http://schemas.microsoft.com/office/2006/metadata/properties"/>
+    <ds:schemaRef ds:uri="http://schemas.microsoft.com/office/infopath/2007/PartnerControls"/>
+    <ds:schemaRef ds:uri="7432f127-f33c-42e2-a68a-9048c01697a7"/>
+    <ds:schemaRef ds:uri="b69dc6fa-2096-41e7-baef-054d5bf17313"/>
   </ds:schemaRefs>
 </ds:datastoreItem>
 </file>
 
 <file path=customXml/itemProps4.xml><?xml version="1.0" encoding="utf-8"?>
-<ds:datastoreItem xmlns:ds="http://schemas.openxmlformats.org/officeDocument/2006/customXml" ds:itemID="{B4A64242-4ED2-4431-9BBC-6C9F087A3F0B}">
-  <ds:schemaRefs>
-    <ds:schemaRef ds:uri="http://schemas.openxmlformats.org/officeDocument/2006/bibliography"/>
-  </ds:schemaRefs>
-</ds:datastoreItem>
-</file>
-
-<file path=customXml/itemProps5.xml><?xml version="1.0" encoding="utf-8"?>
 <ds:datastoreItem xmlns:ds="http://schemas.openxmlformats.org/officeDocument/2006/customXml" ds:itemID="{11111111-1234-1234-1234-123412341234}">
   <ds:schemaRefs>
     <ds:schemaRef ds:uri="http://customooxmlschemas.google.com/"/>
@@ -7330,13 +7954,18 @@
 </ds:datastoreItem>
 </file>
 
+<file path=customXml/itemProps5.xml><?xml version="1.0" encoding="utf-8"?>
+<ds:datastoreItem xmlns:ds="http://schemas.openxmlformats.org/officeDocument/2006/customXml" ds:itemID="{B4A64242-4ED2-4431-9BBC-6C9F087A3F0B}">
+  <ds:schemaRefs>
+    <ds:schemaRef ds:uri="http://schemas.openxmlformats.org/officeDocument/2006/bibliography"/>
+  </ds:schemaRefs>
+</ds:datastoreItem>
+</file>
+
 <file path=customXml/itemProps6.xml><?xml version="1.0" encoding="utf-8"?>
-<ds:datastoreItem xmlns:ds="http://schemas.openxmlformats.org/officeDocument/2006/customXml" ds:itemID="{AB6D30A6-B7AA-49D0-8DAC-77DF30570A2D}">
+<ds:datastoreItem xmlns:ds="http://schemas.openxmlformats.org/officeDocument/2006/customXml" ds:itemID="{001C8AF1-0A5A-4192-973C-413DD19C3B92}">
   <ds:schemaRefs>
-    <ds:schemaRef ds:uri="http://schemas.microsoft.com/office/2006/metadata/properties"/>
-    <ds:schemaRef ds:uri="http://schemas.microsoft.com/office/infopath/2007/PartnerControls"/>
-    <ds:schemaRef ds:uri="7432f127-f33c-42e2-a68a-9048c01697a7"/>
-    <ds:schemaRef ds:uri="b69dc6fa-2096-41e7-baef-054d5bf17313"/>
+    <ds:schemaRef ds:uri="http://schemas.microsoft.com/sharepoint/events"/>
   </ds:schemaRefs>
 </ds:datastoreItem>
 </file>
</xml_diff>